<commit_message>
Upgrade dossier infographics to reference-grade visual design
Redesign all diagrams with a professional design system modelled on the
provided reference infographics: pastel panel backgrounds per layer/group,
rounded white cards with coloured borders and title/body hierarchy,
numbered step badges, check/cross legend chips, labelled gate callouts,
curved fail/reject return paths, and footer takeaway bars. Adds a sixth
diagram: per-workflow swimlane schematics showing each Logic App's trigger,
steps, and human-approval gates.

Word document rebuilt (XSD-validated): the workflow schematic embedded as
Figure 4 (subsequent figures renumbered) and all tables upgraded with
banded alternate-row shading.

Co-Authored-By: Claude Fable 5 <noreply@anthropic.com>

Claude-Session: https://claude.ai/code/session_01NpGkiFWsSNcpz57BBNSGbe
</commit_message>
<xml_diff>
--- a/project-dossier/Project-Dossier-InfoSec-Assurance-Agent-Platform.docx
+++ b/project-dossier/Project-Dossier-InfoSec-Assurance-Agent-Platform.docx
@@ -213,6 +213,7 @@
         <w:tc>
           <w:tcPr>
             <w:tcW w:type="dxa" w:w="2600"/>
+            <w:shd w:fill="E4F3F1" w:val="clear"/>
             <w:tcMar>
               <w:top w:type="dxa" w:w="60"/>
               <w:left w:type="dxa" w:w="100"/>
@@ -235,6 +236,7 @@
         <w:tc>
           <w:tcPr>
             <w:tcW w:type="dxa" w:w="6760"/>
+            <w:shd w:fill="E4F3F1" w:val="clear"/>
             <w:tcMar>
               <w:top w:type="dxa" w:w="60"/>
               <w:left w:type="dxa" w:w="100"/>
@@ -305,6 +307,7 @@
         <w:tc>
           <w:tcPr>
             <w:tcW w:type="dxa" w:w="2600"/>
+            <w:shd w:fill="E4F3F1" w:val="clear"/>
             <w:tcMar>
               <w:top w:type="dxa" w:w="60"/>
               <w:left w:type="dxa" w:w="100"/>
@@ -327,6 +330,7 @@
         <w:tc>
           <w:tcPr>
             <w:tcW w:type="dxa" w:w="6760"/>
+            <w:shd w:fill="E4F3F1" w:val="clear"/>
             <w:tcMar>
               <w:top w:type="dxa" w:w="60"/>
               <w:left w:type="dxa" w:w="100"/>
@@ -397,6 +401,7 @@
         <w:tc>
           <w:tcPr>
             <w:tcW w:type="dxa" w:w="2600"/>
+            <w:shd w:fill="E4F3F1" w:val="clear"/>
             <w:tcMar>
               <w:top w:type="dxa" w:w="60"/>
               <w:left w:type="dxa" w:w="100"/>
@@ -419,6 +424,7 @@
         <w:tc>
           <w:tcPr>
             <w:tcW w:type="dxa" w:w="6760"/>
+            <w:shd w:fill="E4F3F1" w:val="clear"/>
             <w:tcMar>
               <w:top w:type="dxa" w:w="60"/>
               <w:left w:type="dxa" w:w="100"/>
@@ -957,6 +963,7 @@
         <w:tc>
           <w:tcPr>
             <w:tcW w:type="dxa" w:w="900"/>
+            <w:shd w:fill="E4F3F1" w:val="clear"/>
             <w:tcMar>
               <w:top w:type="dxa" w:w="60"/>
               <w:left w:type="dxa" w:w="100"/>
@@ -979,6 +986,7 @@
         <w:tc>
           <w:tcPr>
             <w:tcW w:type="dxa" w:w="5060"/>
+            <w:shd w:fill="E4F3F1" w:val="clear"/>
             <w:tcMar>
               <w:top w:type="dxa" w:w="60"/>
               <w:left w:type="dxa" w:w="100"/>
@@ -1001,6 +1009,7 @@
         <w:tc>
           <w:tcPr>
             <w:tcW w:type="dxa" w:w="3400"/>
+            <w:shd w:fill="E4F3F1" w:val="clear"/>
             <w:tcMar>
               <w:top w:type="dxa" w:w="60"/>
               <w:left w:type="dxa" w:w="100"/>
@@ -1093,6 +1102,7 @@
         <w:tc>
           <w:tcPr>
             <w:tcW w:type="dxa" w:w="900"/>
+            <w:shd w:fill="E4F3F1" w:val="clear"/>
             <w:tcMar>
               <w:top w:type="dxa" w:w="60"/>
               <w:left w:type="dxa" w:w="100"/>
@@ -1115,6 +1125,7 @@
         <w:tc>
           <w:tcPr>
             <w:tcW w:type="dxa" w:w="5060"/>
+            <w:shd w:fill="E4F3F1" w:val="clear"/>
             <w:tcMar>
               <w:top w:type="dxa" w:w="60"/>
               <w:left w:type="dxa" w:w="100"/>
@@ -1137,6 +1148,7 @@
         <w:tc>
           <w:tcPr>
             <w:tcW w:type="dxa" w:w="3400"/>
+            <w:shd w:fill="E4F3F1" w:val="clear"/>
             <w:tcMar>
               <w:top w:type="dxa" w:w="60"/>
               <w:left w:type="dxa" w:w="100"/>
@@ -1229,6 +1241,7 @@
         <w:tc>
           <w:tcPr>
             <w:tcW w:type="dxa" w:w="900"/>
+            <w:shd w:fill="E4F3F1" w:val="clear"/>
             <w:tcMar>
               <w:top w:type="dxa" w:w="60"/>
               <w:left w:type="dxa" w:w="100"/>
@@ -1251,6 +1264,7 @@
         <w:tc>
           <w:tcPr>
             <w:tcW w:type="dxa" w:w="5060"/>
+            <w:shd w:fill="E4F3F1" w:val="clear"/>
             <w:tcMar>
               <w:top w:type="dxa" w:w="60"/>
               <w:left w:type="dxa" w:w="100"/>
@@ -1273,6 +1287,7 @@
         <w:tc>
           <w:tcPr>
             <w:tcW w:type="dxa" w:w="3400"/>
+            <w:shd w:fill="E4F3F1" w:val="clear"/>
             <w:tcMar>
               <w:top w:type="dxa" w:w="60"/>
               <w:left w:type="dxa" w:w="100"/>
@@ -1542,6 +1557,7 @@
         <w:tc>
           <w:tcPr>
             <w:tcW w:type="dxa" w:w="900"/>
+            <w:shd w:fill="E4F3F1" w:val="clear"/>
             <w:tcMar>
               <w:top w:type="dxa" w:w="60"/>
               <w:left w:type="dxa" w:w="100"/>
@@ -1564,6 +1580,7 @@
         <w:tc>
           <w:tcPr>
             <w:tcW w:type="dxa" w:w="5060"/>
+            <w:shd w:fill="E4F3F1" w:val="clear"/>
             <w:tcMar>
               <w:top w:type="dxa" w:w="60"/>
               <w:left w:type="dxa" w:w="100"/>
@@ -1586,6 +1603,7 @@
         <w:tc>
           <w:tcPr>
             <w:tcW w:type="dxa" w:w="3400"/>
+            <w:shd w:fill="E4F3F1" w:val="clear"/>
             <w:tcMar>
               <w:top w:type="dxa" w:w="60"/>
               <w:left w:type="dxa" w:w="100"/>
@@ -1678,6 +1696,7 @@
         <w:tc>
           <w:tcPr>
             <w:tcW w:type="dxa" w:w="900"/>
+            <w:shd w:fill="E4F3F1" w:val="clear"/>
             <w:tcMar>
               <w:top w:type="dxa" w:w="60"/>
               <w:left w:type="dxa" w:w="100"/>
@@ -1700,6 +1719,7 @@
         <w:tc>
           <w:tcPr>
             <w:tcW w:type="dxa" w:w="5060"/>
+            <w:shd w:fill="E4F3F1" w:val="clear"/>
             <w:tcMar>
               <w:top w:type="dxa" w:w="60"/>
               <w:left w:type="dxa" w:w="100"/>
@@ -1722,6 +1742,7 @@
         <w:tc>
           <w:tcPr>
             <w:tcW w:type="dxa" w:w="3400"/>
+            <w:shd w:fill="E4F3F1" w:val="clear"/>
             <w:tcMar>
               <w:top w:type="dxa" w:w="60"/>
               <w:left w:type="dxa" w:w="100"/>
@@ -1991,6 +2012,7 @@
         <w:tc>
           <w:tcPr>
             <w:tcW w:type="dxa" w:w="900"/>
+            <w:shd w:fill="E4F3F1" w:val="clear"/>
             <w:tcMar>
               <w:top w:type="dxa" w:w="60"/>
               <w:left w:type="dxa" w:w="100"/>
@@ -2013,6 +2035,7 @@
         <w:tc>
           <w:tcPr>
             <w:tcW w:type="dxa" w:w="5060"/>
+            <w:shd w:fill="E4F3F1" w:val="clear"/>
             <w:tcMar>
               <w:top w:type="dxa" w:w="60"/>
               <w:left w:type="dxa" w:w="100"/>
@@ -2035,6 +2058,7 @@
         <w:tc>
           <w:tcPr>
             <w:tcW w:type="dxa" w:w="3400"/>
+            <w:shd w:fill="E4F3F1" w:val="clear"/>
             <w:tcMar>
               <w:top w:type="dxa" w:w="60"/>
               <w:left w:type="dxa" w:w="100"/>
@@ -2127,6 +2151,7 @@
         <w:tc>
           <w:tcPr>
             <w:tcW w:type="dxa" w:w="900"/>
+            <w:shd w:fill="E4F3F1" w:val="clear"/>
             <w:tcMar>
               <w:top w:type="dxa" w:w="60"/>
               <w:left w:type="dxa" w:w="100"/>
@@ -2149,6 +2174,7 @@
         <w:tc>
           <w:tcPr>
             <w:tcW w:type="dxa" w:w="5060"/>
+            <w:shd w:fill="E4F3F1" w:val="clear"/>
             <w:tcMar>
               <w:top w:type="dxa" w:w="60"/>
               <w:left w:type="dxa" w:w="100"/>
@@ -2171,6 +2197,7 @@
         <w:tc>
           <w:tcPr>
             <w:tcW w:type="dxa" w:w="3400"/>
+            <w:shd w:fill="E4F3F1" w:val="clear"/>
             <w:tcMar>
               <w:top w:type="dxa" w:w="60"/>
               <w:left w:type="dxa" w:w="100"/>
@@ -2263,6 +2290,7 @@
         <w:tc>
           <w:tcPr>
             <w:tcW w:type="dxa" w:w="900"/>
+            <w:shd w:fill="E4F3F1" w:val="clear"/>
             <w:tcMar>
               <w:top w:type="dxa" w:w="60"/>
               <w:left w:type="dxa" w:w="100"/>
@@ -2285,6 +2313,7 @@
         <w:tc>
           <w:tcPr>
             <w:tcW w:type="dxa" w:w="5060"/>
+            <w:shd w:fill="E4F3F1" w:val="clear"/>
             <w:tcMar>
               <w:top w:type="dxa" w:w="60"/>
               <w:left w:type="dxa" w:w="100"/>
@@ -2307,6 +2336,7 @@
         <w:tc>
           <w:tcPr>
             <w:tcW w:type="dxa" w:w="3400"/>
+            <w:shd w:fill="E4F3F1" w:val="clear"/>
             <w:tcMar>
               <w:top w:type="dxa" w:w="60"/>
               <w:left w:type="dxa" w:w="100"/>
@@ -2571,6 +2601,7 @@
         <w:tc>
           <w:tcPr>
             <w:tcW w:type="dxa" w:w="1800"/>
+            <w:shd w:fill="E4F3F1" w:val="clear"/>
             <w:tcMar>
               <w:top w:type="dxa" w:w="60"/>
               <w:left w:type="dxa" w:w="100"/>
@@ -2593,6 +2624,7 @@
         <w:tc>
           <w:tcPr>
             <w:tcW w:type="dxa" w:w="4260"/>
+            <w:shd w:fill="E4F3F1" w:val="clear"/>
             <w:tcMar>
               <w:top w:type="dxa" w:w="60"/>
               <w:left w:type="dxa" w:w="100"/>
@@ -2615,6 +2647,7 @@
         <w:tc>
           <w:tcPr>
             <w:tcW w:type="dxa" w:w="3300"/>
+            <w:shd w:fill="E4F3F1" w:val="clear"/>
             <w:tcMar>
               <w:top w:type="dxa" w:w="60"/>
               <w:left w:type="dxa" w:w="100"/>
@@ -2707,6 +2740,7 @@
         <w:tc>
           <w:tcPr>
             <w:tcW w:type="dxa" w:w="1800"/>
+            <w:shd w:fill="E4F3F1" w:val="clear"/>
             <w:tcMar>
               <w:top w:type="dxa" w:w="60"/>
               <w:left w:type="dxa" w:w="100"/>
@@ -2729,6 +2763,7 @@
         <w:tc>
           <w:tcPr>
             <w:tcW w:type="dxa" w:w="4260"/>
+            <w:shd w:fill="E4F3F1" w:val="clear"/>
             <w:tcMar>
               <w:top w:type="dxa" w:w="60"/>
               <w:left w:type="dxa" w:w="100"/>
@@ -2751,6 +2786,7 @@
         <w:tc>
           <w:tcPr>
             <w:tcW w:type="dxa" w:w="3300"/>
+            <w:shd w:fill="E4F3F1" w:val="clear"/>
             <w:tcMar>
               <w:top w:type="dxa" w:w="60"/>
               <w:left w:type="dxa" w:w="100"/>
@@ -2843,6 +2879,7 @@
         <w:tc>
           <w:tcPr>
             <w:tcW w:type="dxa" w:w="1800"/>
+            <w:shd w:fill="E4F3F1" w:val="clear"/>
             <w:tcMar>
               <w:top w:type="dxa" w:w="60"/>
               <w:left w:type="dxa" w:w="100"/>
@@ -2865,6 +2902,7 @@
         <w:tc>
           <w:tcPr>
             <w:tcW w:type="dxa" w:w="4260"/>
+            <w:shd w:fill="E4F3F1" w:val="clear"/>
             <w:tcMar>
               <w:top w:type="dxa" w:w="60"/>
               <w:left w:type="dxa" w:w="100"/>
@@ -2887,6 +2925,7 @@
         <w:tc>
           <w:tcPr>
             <w:tcW w:type="dxa" w:w="3300"/>
+            <w:shd w:fill="E4F3F1" w:val="clear"/>
             <w:tcMar>
               <w:top w:type="dxa" w:w="60"/>
               <w:left w:type="dxa" w:w="100"/>
@@ -2939,7 +2978,7 @@
       <w:r>
         <w:drawing>
           <wp:inline distT="0" distB="0" distL="0" distR="0">
-            <wp:extent cx="5905500" cy="3571875"/>
+            <wp:extent cx="5905500" cy="4200525"/>
             <wp:effectExtent t="0" r="0" b="0" l="0"/>
             <wp:docPr id="1" name="" descr="" title=""/>
             <wp:cNvGraphicFramePr>
@@ -2964,7 +3003,7 @@
                   <pic:spPr bwMode="auto">
                     <a:xfrm>
                       <a:off x="0" y="0"/>
-                      <a:ext cx="5905500" cy="3571875"/>
+                      <a:ext cx="5905500" cy="4200525"/>
                     </a:xfrm>
                     <a:prstGeom prst="rect">
                       <a:avLst/>
@@ -3121,6 +3160,7 @@
         <w:tc>
           <w:tcPr>
             <w:tcW w:type="dxa" w:w="3200"/>
+            <w:shd w:fill="E4F3F1" w:val="clear"/>
             <w:tcMar>
               <w:top w:type="dxa" w:w="60"/>
               <w:left w:type="dxa" w:w="100"/>
@@ -3143,6 +3183,7 @@
         <w:tc>
           <w:tcPr>
             <w:tcW w:type="dxa" w:w="6160"/>
+            <w:shd w:fill="E4F3F1" w:val="clear"/>
             <w:tcMar>
               <w:top w:type="dxa" w:w="60"/>
               <w:left w:type="dxa" w:w="100"/>
@@ -3213,6 +3254,7 @@
         <w:tc>
           <w:tcPr>
             <w:tcW w:type="dxa" w:w="3200"/>
+            <w:shd w:fill="E4F3F1" w:val="clear"/>
             <w:tcMar>
               <w:top w:type="dxa" w:w="60"/>
               <w:left w:type="dxa" w:w="100"/>
@@ -3235,6 +3277,7 @@
         <w:tc>
           <w:tcPr>
             <w:tcW w:type="dxa" w:w="6160"/>
+            <w:shd w:fill="E4F3F1" w:val="clear"/>
             <w:tcMar>
               <w:top w:type="dxa" w:w="60"/>
               <w:left w:type="dxa" w:w="100"/>
@@ -3305,6 +3348,7 @@
         <w:tc>
           <w:tcPr>
             <w:tcW w:type="dxa" w:w="3200"/>
+            <w:shd w:fill="E4F3F1" w:val="clear"/>
             <w:tcMar>
               <w:top w:type="dxa" w:w="60"/>
               <w:left w:type="dxa" w:w="100"/>
@@ -3327,6 +3371,7 @@
         <w:tc>
           <w:tcPr>
             <w:tcW w:type="dxa" w:w="6160"/>
+            <w:shd w:fill="E4F3F1" w:val="clear"/>
             <w:tcMar>
               <w:top w:type="dxa" w:w="60"/>
               <w:left w:type="dxa" w:w="100"/>
@@ -3527,6 +3572,7 @@
         <w:tc>
           <w:tcPr>
             <w:tcW w:type="dxa" w:w="3200"/>
+            <w:shd w:fill="E4F3F1" w:val="clear"/>
             <w:tcMar>
               <w:top w:type="dxa" w:w="60"/>
               <w:left w:type="dxa" w:w="100"/>
@@ -3549,6 +3595,7 @@
         <w:tc>
           <w:tcPr>
             <w:tcW w:type="dxa" w:w="6160"/>
+            <w:shd w:fill="E4F3F1" w:val="clear"/>
             <w:tcMar>
               <w:top w:type="dxa" w:w="60"/>
               <w:left w:type="dxa" w:w="100"/>
@@ -3619,6 +3666,7 @@
         <w:tc>
           <w:tcPr>
             <w:tcW w:type="dxa" w:w="3200"/>
+            <w:shd w:fill="E4F3F1" w:val="clear"/>
             <w:tcMar>
               <w:top w:type="dxa" w:w="60"/>
               <w:left w:type="dxa" w:w="100"/>
@@ -3641,6 +3689,7 @@
         <w:tc>
           <w:tcPr>
             <w:tcW w:type="dxa" w:w="6160"/>
+            <w:shd w:fill="E4F3F1" w:val="clear"/>
             <w:tcMar>
               <w:top w:type="dxa" w:w="60"/>
               <w:left w:type="dxa" w:w="100"/>
@@ -3688,7 +3737,7 @@
       <w:r>
         <w:drawing>
           <wp:inline distT="0" distB="0" distL="0" distR="0">
-            <wp:extent cx="5905500" cy="2609850"/>
+            <wp:extent cx="5905500" cy="3067050"/>
             <wp:effectExtent t="0" r="0" b="0" l="0"/>
             <wp:docPr id="1" name="" descr="" title=""/>
             <wp:cNvGraphicFramePr>
@@ -3713,7 +3762,7 @@
                   <pic:spPr bwMode="auto">
                     <a:xfrm>
                       <a:off x="0" y="0"/>
-                      <a:ext cx="5905500" cy="2609850"/>
+                      <a:ext cx="5905500" cy="3067050"/>
                     </a:xfrm>
                     <a:prstGeom prst="rect">
                       <a:avLst/>
@@ -3800,387 +3849,6 @@
         <w:t xml:space="preserve">Four Logic Apps workflows replace the claude.ai Routines. Every submission of record inside them suspends on a human-approval webhook (3-day expiry): the draft goes to the approver, the workflow waits for an approved/rejected callback, and rejections are recorded without submitting.</w:t>
       </w:r>
     </w:p>
-    <w:tbl>
-      <w:tblPr>
-        <w:tblW w:type="dxa" w:w="9360"/>
-        <w:tblBorders>
-          <w:top w:val="single" w:color="auto" w:sz="4"/>
-          <w:left w:val="single" w:color="auto" w:sz="4"/>
-          <w:bottom w:val="single" w:color="auto" w:sz="4"/>
-          <w:right w:val="single" w:color="auto" w:sz="4"/>
-          <w:insideH w:val="single" w:color="auto" w:sz="4"/>
-          <w:insideV w:val="single" w:color="auto" w:sz="4"/>
-        </w:tblBorders>
-      </w:tblPr>
-      <w:tblGrid>
-        <w:gridCol w:w="2400"/>
-        <w:gridCol w:w="1800"/>
-        <w:gridCol w:w="5160"/>
-      </w:tblGrid>
-      <w:tr>
-        <w:trPr>
-          <w:tblHeader/>
-        </w:trPr>
-        <w:tc>
-          <w:tcPr>
-            <w:tcW w:type="dxa" w:w="2400"/>
-            <w:shd w:fill="008D7F" w:val="clear"/>
-            <w:tcMar>
-              <w:top w:type="dxa" w:w="60"/>
-              <w:left w:type="dxa" w:w="100"/>
-              <w:bottom w:type="dxa" w:w="60"/>
-              <w:right w:type="dxa" w:w="100"/>
-            </w:tcMar>
-          </w:tcPr>
-          <w:p>
-            <w:r>
-              <w:rPr>
-                <w:b/>
-                <w:bCs/>
-                <w:color w:val="FFFFFF"/>
-                <w:sz w:val="19"/>
-                <w:szCs w:val="19"/>
-              </w:rPr>
-              <w:t xml:space="preserve">Workflow</w:t>
-            </w:r>
-          </w:p>
-        </w:tc>
-        <w:tc>
-          <w:tcPr>
-            <w:tcW w:type="dxa" w:w="1800"/>
-            <w:shd w:fill="008D7F" w:val="clear"/>
-            <w:tcMar>
-              <w:top w:type="dxa" w:w="60"/>
-              <w:left w:type="dxa" w:w="100"/>
-              <w:bottom w:type="dxa" w:w="60"/>
-              <w:right w:type="dxa" w:w="100"/>
-            </w:tcMar>
-          </w:tcPr>
-          <w:p>
-            <w:r>
-              <w:rPr>
-                <w:b/>
-                <w:bCs/>
-                <w:color w:val="FFFFFF"/>
-                <w:sz w:val="19"/>
-                <w:szCs w:val="19"/>
-              </w:rPr>
-              <w:t xml:space="preserve">Trigger</w:t>
-            </w:r>
-          </w:p>
-        </w:tc>
-        <w:tc>
-          <w:tcPr>
-            <w:tcW w:type="dxa" w:w="5160"/>
-            <w:shd w:fill="008D7F" w:val="clear"/>
-            <w:tcMar>
-              <w:top w:type="dxa" w:w="60"/>
-              <w:left w:type="dxa" w:w="100"/>
-              <w:bottom w:type="dxa" w:w="60"/>
-              <w:right w:type="dxa" w:w="100"/>
-            </w:tcMar>
-          </w:tcPr>
-          <w:p>
-            <w:r>
-              <w:rPr>
-                <w:b/>
-                <w:bCs/>
-                <w:color w:val="FFFFFF"/>
-                <w:sz w:val="19"/>
-                <w:szCs w:val="19"/>
-              </w:rPr>
-              <w:t xml:space="preserve">Path (approval gates in bold)</w:t>
-            </w:r>
-          </w:p>
-        </w:tc>
-      </w:tr>
-      <w:tr>
-        <w:tc>
-          <w:tcPr>
-            <w:tcW w:type="dxa" w:w="2400"/>
-            <w:tcMar>
-              <w:top w:type="dxa" w:w="60"/>
-              <w:left w:type="dxa" w:w="100"/>
-              <w:bottom w:type="dxa" w:w="60"/>
-              <w:right w:type="dxa" w:w="100"/>
-            </w:tcMar>
-          </w:tcPr>
-          <w:p>
-            <w:r>
-              <w:rPr>
-                <w:b w:val="false"/>
-                <w:bCs w:val="false"/>
-                <w:sz w:val="19"/>
-                <w:szCs w:val="19"/>
-              </w:rPr>
-              <w:t xml:space="preserve">onetrust-assessment-intake</w:t>
-            </w:r>
-          </w:p>
-        </w:tc>
-        <w:tc>
-          <w:tcPr>
-            <w:tcW w:type="dxa" w:w="1800"/>
-            <w:tcMar>
-              <w:top w:type="dxa" w:w="60"/>
-              <w:left w:type="dxa" w:w="100"/>
-              <w:bottom w:type="dxa" w:w="60"/>
-              <w:right w:type="dxa" w:w="100"/>
-            </w:tcMar>
-          </w:tcPr>
-          <w:p>
-            <w:r>
-              <w:rPr>
-                <w:b w:val="false"/>
-                <w:bCs w:val="false"/>
-                <w:sz w:val="19"/>
-                <w:szCs w:val="19"/>
-              </w:rPr>
-              <w:t xml:space="preserve">Daily</w:t>
-            </w:r>
-          </w:p>
-        </w:tc>
-        <w:tc>
-          <w:tcPr>
-            <w:tcW w:type="dxa" w:w="5160"/>
-            <w:tcMar>
-              <w:top w:type="dxa" w:w="60"/>
-              <w:left w:type="dxa" w:w="100"/>
-              <w:bottom w:type="dxa" w:w="60"/>
-              <w:right w:type="dxa" w:w="100"/>
-            </w:tcMar>
-          </w:tcPr>
-          <w:p>
-            <w:r>
-              <w:rPr>
-                <w:b w:val="false"/>
-                <w:bCs w:val="false"/>
-                <w:sz w:val="19"/>
-                <w:szCs w:val="19"/>
-              </w:rPr>
-              <w:t xml:space="preserve">Fetch completed OneTrust assessments → dpia agent report → APPROVAL → SharePoint upload → Teams summary</w:t>
-            </w:r>
-          </w:p>
-        </w:tc>
-      </w:tr>
-      <w:tr>
-        <w:tc>
-          <w:tcPr>
-            <w:tcW w:type="dxa" w:w="2400"/>
-            <w:tcMar>
-              <w:top w:type="dxa" w:w="60"/>
-              <w:left w:type="dxa" w:w="100"/>
-              <w:bottom w:type="dxa" w:w="60"/>
-              <w:right w:type="dxa" w:w="100"/>
-            </w:tcMar>
-          </w:tcPr>
-          <w:p>
-            <w:r>
-              <w:rPr>
-                <w:b w:val="false"/>
-                <w:bCs w:val="false"/>
-                <w:sz w:val="19"/>
-                <w:szCs w:val="19"/>
-              </w:rPr>
-              <w:t xml:space="preserve">defender-incident-brief</w:t>
-            </w:r>
-          </w:p>
-        </w:tc>
-        <w:tc>
-          <w:tcPr>
-            <w:tcW w:type="dxa" w:w="1800"/>
-            <w:tcMar>
-              <w:top w:type="dxa" w:w="60"/>
-              <w:left w:type="dxa" w:w="100"/>
-              <w:bottom w:type="dxa" w:w="60"/>
-              <w:right w:type="dxa" w:w="100"/>
-            </w:tcMar>
-          </w:tcPr>
-          <w:p>
-            <w:r>
-              <w:rPr>
-                <w:b w:val="false"/>
-                <w:bCs w:val="false"/>
-                <w:sz w:val="19"/>
-                <w:szCs w:val="19"/>
-              </w:rPr>
-              <w:t xml:space="preserve">Defender/Sentinel webhook</w:t>
-            </w:r>
-          </w:p>
-        </w:tc>
-        <w:tc>
-          <w:tcPr>
-            <w:tcW w:type="dxa" w:w="5160"/>
-            <w:tcMar>
-              <w:top w:type="dxa" w:w="60"/>
-              <w:left w:type="dxa" w:w="100"/>
-              <w:bottom w:type="dxa" w:w="60"/>
-              <w:right w:type="dxa" w:w="100"/>
-            </w:tcMar>
-          </w:tcPr>
-          <w:p>
-            <w:r>
-              <w:rPr>
-                <w:b w:val="false"/>
-                <w:bCs w:val="false"/>
-                <w:sz w:val="19"/>
-                <w:szCs w:val="19"/>
-              </w:rPr>
-              <w:t xml:space="preserve">cyber-forum brief (immediate 200 to caller) → APPROVAL → Jira issue</w:t>
-            </w:r>
-          </w:p>
-        </w:tc>
-      </w:tr>
-      <w:tr>
-        <w:tc>
-          <w:tcPr>
-            <w:tcW w:type="dxa" w:w="2400"/>
-            <w:tcMar>
-              <w:top w:type="dxa" w:w="60"/>
-              <w:left w:type="dxa" w:w="100"/>
-              <w:bottom w:type="dxa" w:w="60"/>
-              <w:right w:type="dxa" w:w="100"/>
-            </w:tcMar>
-          </w:tcPr>
-          <w:p>
-            <w:r>
-              <w:rPr>
-                <w:b w:val="false"/>
-                <w:bCs w:val="false"/>
-                <w:sz w:val="19"/>
-                <w:szCs w:val="19"/>
-              </w:rPr>
-              <w:t xml:space="preserve">scheduled-deepsearch</w:t>
-            </w:r>
-          </w:p>
-        </w:tc>
-        <w:tc>
-          <w:tcPr>
-            <w:tcW w:type="dxa" w:w="1800"/>
-            <w:tcMar>
-              <w:top w:type="dxa" w:w="60"/>
-              <w:left w:type="dxa" w:w="100"/>
-              <w:bottom w:type="dxa" w:w="60"/>
-              <w:right w:type="dxa" w:w="100"/>
-            </w:tcMar>
-          </w:tcPr>
-          <w:p>
-            <w:r>
-              <w:rPr>
-                <w:b w:val="false"/>
-                <w:bCs w:val="false"/>
-                <w:sz w:val="19"/>
-                <w:szCs w:val="19"/>
-              </w:rPr>
-              <w:t xml:space="preserve">Weekly</w:t>
-            </w:r>
-          </w:p>
-        </w:tc>
-        <w:tc>
-          <w:tcPr>
-            <w:tcW w:type="dxa" w:w="5160"/>
-            <w:tcMar>
-              <w:top w:type="dxa" w:w="60"/>
-              <w:left w:type="dxa" w:w="100"/>
-              <w:bottom w:type="dxa" w:w="60"/>
-              <w:right w:type="dxa" w:w="100"/>
-            </w:tcMar>
-          </w:tcPr>
-          <w:p>
-            <w:r>
-              <w:rPr>
-                <w:b w:val="false"/>
-                <w:bCs w:val="false"/>
-                <w:sz w:val="19"/>
-                <w:szCs w:val="19"/>
-              </w:rPr>
-              <w:t xml:space="preserve">Supplier watchlist (SharePoint) → deepsearch agent per supplier → APPROVAL → dashboard to SharePoint → low score? → APPROVAL → Jira ticket</w:t>
-            </w:r>
-          </w:p>
-        </w:tc>
-      </w:tr>
-      <w:tr>
-        <w:tc>
-          <w:tcPr>
-            <w:tcW w:type="dxa" w:w="2400"/>
-            <w:tcMar>
-              <w:top w:type="dxa" w:w="60"/>
-              <w:left w:type="dxa" w:w="100"/>
-              <w:bottom w:type="dxa" w:w="60"/>
-              <w:right w:type="dxa" w:w="100"/>
-            </w:tcMar>
-          </w:tcPr>
-          <w:p>
-            <w:r>
-              <w:rPr>
-                <w:b w:val="false"/>
-                <w:bCs w:val="false"/>
-                <w:sz w:val="19"/>
-                <w:szCs w:val="19"/>
-              </w:rPr>
-              <w:t xml:space="preserve">jira-finding-sync</w:t>
-            </w:r>
-          </w:p>
-        </w:tc>
-        <w:tc>
-          <w:tcPr>
-            <w:tcW w:type="dxa" w:w="1800"/>
-            <w:tcMar>
-              <w:top w:type="dxa" w:w="60"/>
-              <w:left w:type="dxa" w:w="100"/>
-              <w:bottom w:type="dxa" w:w="60"/>
-              <w:right w:type="dxa" w:w="100"/>
-            </w:tcMar>
-          </w:tcPr>
-          <w:p>
-            <w:r>
-              <w:rPr>
-                <w:b w:val="false"/>
-                <w:bCs w:val="false"/>
-                <w:sz w:val="19"/>
-                <w:szCs w:val="19"/>
-              </w:rPr>
-              <w:t xml:space="preserve">Hourly</w:t>
-            </w:r>
-          </w:p>
-        </w:tc>
-        <w:tc>
-          <w:tcPr>
-            <w:tcW w:type="dxa" w:w="5160"/>
-            <w:tcMar>
-              <w:top w:type="dxa" w:w="60"/>
-              <w:left w:type="dxa" w:w="100"/>
-              <w:bottom w:type="dxa" w:w="60"/>
-              <w:right w:type="dxa" w:w="100"/>
-            </w:tcMar>
-          </w:tcPr>
-          <w:p>
-            <w:r>
-              <w:rPr>
-                <w:b w:val="false"/>
-                <w:bCs w:val="false"/>
-                <w:sz w:val="19"/>
-                <w:szCs w:val="19"/>
-              </w:rPr>
-              <w:t xml:space="preserve">JQL updated TPRM findings → APPROVAL → submit status to IAF API → Jira comment on failure</w:t>
-            </w:r>
-          </w:p>
-        </w:tc>
-      </w:tr>
-    </w:tbl>
-    <w:p>
-      <w:pPr>
-        <w:spacing w:after="200"/>
-      </w:pPr>
-    </w:p>
-    <w:p>
-      <w:pPr>
-        <w:spacing w:after="140"/>
-        <w:jc w:val="both"/>
-      </w:pPr>
-      <w:r>
-        <w:t xml:space="preserve">The complete release path for any deliverable, in or out of the workflows, is:</w:t>
-      </w:r>
-    </w:p>
     <w:p>
       <w:pPr>
         <w:spacing w:after="60" w:before="200"/>
@@ -4189,7 +3857,7 @@
       <w:r>
         <w:drawing>
           <wp:inline distT="0" distB="0" distL="0" distR="0">
-            <wp:extent cx="5905500" cy="2800350"/>
+            <wp:extent cx="5905500" cy="4029075"/>
             <wp:effectExtent t="0" r="0" b="0" l="0"/>
             <wp:docPr id="1" name="" descr="" title=""/>
             <wp:cNvGraphicFramePr>
@@ -4214,7 +3882,7 @@
                   <pic:spPr bwMode="auto">
                     <a:xfrm>
                       <a:off x="0" y="0"/>
-                      <a:ext cx="5905500" cy="2800350"/>
+                      <a:ext cx="5905500" cy="4029075"/>
                     </a:xfrm>
                     <a:prstGeom prst="rect">
                       <a:avLst/>
@@ -4240,17 +3908,386 @@
           <w:sz w:val="18"/>
           <w:szCs w:val="18"/>
         </w:rPr>
-        <w:t xml:space="preserve">Figure 3 — Release path: reflexive self-check → independent verifier → human approval → gated submission</w:t>
-      </w:r>
-    </w:p>
-    <w:p>
-      <w:pPr>
-        <w:pStyle w:val="Heading1"/>
-        <w:spacing w:after="160" w:before="360"/>
-      </w:pPr>
-      <w:r>
-        <w:t xml:space="preserve">10. Interconnections and Integrations</w:t>
-      </w:r>
+        <w:t xml:space="preserve">Figure 4 — The four automated workflows with their human-approval gates</w:t>
+      </w:r>
+    </w:p>
+    <w:tbl>
+      <w:tblPr>
+        <w:tblW w:type="dxa" w:w="9360"/>
+        <w:tblBorders>
+          <w:top w:val="single" w:color="auto" w:sz="4"/>
+          <w:left w:val="single" w:color="auto" w:sz="4"/>
+          <w:bottom w:val="single" w:color="auto" w:sz="4"/>
+          <w:right w:val="single" w:color="auto" w:sz="4"/>
+          <w:insideH w:val="single" w:color="auto" w:sz="4"/>
+          <w:insideV w:val="single" w:color="auto" w:sz="4"/>
+        </w:tblBorders>
+      </w:tblPr>
+      <w:tblGrid>
+        <w:gridCol w:w="2400"/>
+        <w:gridCol w:w="1800"/>
+        <w:gridCol w:w="5160"/>
+      </w:tblGrid>
+      <w:tr>
+        <w:trPr>
+          <w:tblHeader/>
+        </w:trPr>
+        <w:tc>
+          <w:tcPr>
+            <w:tcW w:type="dxa" w:w="2400"/>
+            <w:shd w:fill="008D7F" w:val="clear"/>
+            <w:tcMar>
+              <w:top w:type="dxa" w:w="60"/>
+              <w:left w:type="dxa" w:w="100"/>
+              <w:bottom w:type="dxa" w:w="60"/>
+              <w:right w:type="dxa" w:w="100"/>
+            </w:tcMar>
+          </w:tcPr>
+          <w:p>
+            <w:r>
+              <w:rPr>
+                <w:b/>
+                <w:bCs/>
+                <w:color w:val="FFFFFF"/>
+                <w:sz w:val="19"/>
+                <w:szCs w:val="19"/>
+              </w:rPr>
+              <w:t xml:space="preserve">Workflow</w:t>
+            </w:r>
+          </w:p>
+        </w:tc>
+        <w:tc>
+          <w:tcPr>
+            <w:tcW w:type="dxa" w:w="1800"/>
+            <w:shd w:fill="008D7F" w:val="clear"/>
+            <w:tcMar>
+              <w:top w:type="dxa" w:w="60"/>
+              <w:left w:type="dxa" w:w="100"/>
+              <w:bottom w:type="dxa" w:w="60"/>
+              <w:right w:type="dxa" w:w="100"/>
+            </w:tcMar>
+          </w:tcPr>
+          <w:p>
+            <w:r>
+              <w:rPr>
+                <w:b/>
+                <w:bCs/>
+                <w:color w:val="FFFFFF"/>
+                <w:sz w:val="19"/>
+                <w:szCs w:val="19"/>
+              </w:rPr>
+              <w:t xml:space="preserve">Trigger</w:t>
+            </w:r>
+          </w:p>
+        </w:tc>
+        <w:tc>
+          <w:tcPr>
+            <w:tcW w:type="dxa" w:w="5160"/>
+            <w:shd w:fill="008D7F" w:val="clear"/>
+            <w:tcMar>
+              <w:top w:type="dxa" w:w="60"/>
+              <w:left w:type="dxa" w:w="100"/>
+              <w:bottom w:type="dxa" w:w="60"/>
+              <w:right w:type="dxa" w:w="100"/>
+            </w:tcMar>
+          </w:tcPr>
+          <w:p>
+            <w:r>
+              <w:rPr>
+                <w:b/>
+                <w:bCs/>
+                <w:color w:val="FFFFFF"/>
+                <w:sz w:val="19"/>
+                <w:szCs w:val="19"/>
+              </w:rPr>
+              <w:t xml:space="preserve">Path (approval gates in bold)</w:t>
+            </w:r>
+          </w:p>
+        </w:tc>
+      </w:tr>
+      <w:tr>
+        <w:tc>
+          <w:tcPr>
+            <w:tcW w:type="dxa" w:w="2400"/>
+            <w:tcMar>
+              <w:top w:type="dxa" w:w="60"/>
+              <w:left w:type="dxa" w:w="100"/>
+              <w:bottom w:type="dxa" w:w="60"/>
+              <w:right w:type="dxa" w:w="100"/>
+            </w:tcMar>
+          </w:tcPr>
+          <w:p>
+            <w:r>
+              <w:rPr>
+                <w:b w:val="false"/>
+                <w:bCs w:val="false"/>
+                <w:sz w:val="19"/>
+                <w:szCs w:val="19"/>
+              </w:rPr>
+              <w:t xml:space="preserve">onetrust-assessment-intake</w:t>
+            </w:r>
+          </w:p>
+        </w:tc>
+        <w:tc>
+          <w:tcPr>
+            <w:tcW w:type="dxa" w:w="1800"/>
+            <w:tcMar>
+              <w:top w:type="dxa" w:w="60"/>
+              <w:left w:type="dxa" w:w="100"/>
+              <w:bottom w:type="dxa" w:w="60"/>
+              <w:right w:type="dxa" w:w="100"/>
+            </w:tcMar>
+          </w:tcPr>
+          <w:p>
+            <w:r>
+              <w:rPr>
+                <w:b w:val="false"/>
+                <w:bCs w:val="false"/>
+                <w:sz w:val="19"/>
+                <w:szCs w:val="19"/>
+              </w:rPr>
+              <w:t xml:space="preserve">Daily</w:t>
+            </w:r>
+          </w:p>
+        </w:tc>
+        <w:tc>
+          <w:tcPr>
+            <w:tcW w:type="dxa" w:w="5160"/>
+            <w:tcMar>
+              <w:top w:type="dxa" w:w="60"/>
+              <w:left w:type="dxa" w:w="100"/>
+              <w:bottom w:type="dxa" w:w="60"/>
+              <w:right w:type="dxa" w:w="100"/>
+            </w:tcMar>
+          </w:tcPr>
+          <w:p>
+            <w:r>
+              <w:rPr>
+                <w:b w:val="false"/>
+                <w:bCs w:val="false"/>
+                <w:sz w:val="19"/>
+                <w:szCs w:val="19"/>
+              </w:rPr>
+              <w:t xml:space="preserve">Fetch completed OneTrust assessments → dpia agent report → APPROVAL → SharePoint upload → Teams summary</w:t>
+            </w:r>
+          </w:p>
+        </w:tc>
+      </w:tr>
+      <w:tr>
+        <w:tc>
+          <w:tcPr>
+            <w:tcW w:type="dxa" w:w="2400"/>
+            <w:shd w:fill="E4F3F1" w:val="clear"/>
+            <w:tcMar>
+              <w:top w:type="dxa" w:w="60"/>
+              <w:left w:type="dxa" w:w="100"/>
+              <w:bottom w:type="dxa" w:w="60"/>
+              <w:right w:type="dxa" w:w="100"/>
+            </w:tcMar>
+          </w:tcPr>
+          <w:p>
+            <w:r>
+              <w:rPr>
+                <w:b w:val="false"/>
+                <w:bCs w:val="false"/>
+                <w:sz w:val="19"/>
+                <w:szCs w:val="19"/>
+              </w:rPr>
+              <w:t xml:space="preserve">defender-incident-brief</w:t>
+            </w:r>
+          </w:p>
+        </w:tc>
+        <w:tc>
+          <w:tcPr>
+            <w:tcW w:type="dxa" w:w="1800"/>
+            <w:shd w:fill="E4F3F1" w:val="clear"/>
+            <w:tcMar>
+              <w:top w:type="dxa" w:w="60"/>
+              <w:left w:type="dxa" w:w="100"/>
+              <w:bottom w:type="dxa" w:w="60"/>
+              <w:right w:type="dxa" w:w="100"/>
+            </w:tcMar>
+          </w:tcPr>
+          <w:p>
+            <w:r>
+              <w:rPr>
+                <w:b w:val="false"/>
+                <w:bCs w:val="false"/>
+                <w:sz w:val="19"/>
+                <w:szCs w:val="19"/>
+              </w:rPr>
+              <w:t xml:space="preserve">Defender/Sentinel webhook</w:t>
+            </w:r>
+          </w:p>
+        </w:tc>
+        <w:tc>
+          <w:tcPr>
+            <w:tcW w:type="dxa" w:w="5160"/>
+            <w:shd w:fill="E4F3F1" w:val="clear"/>
+            <w:tcMar>
+              <w:top w:type="dxa" w:w="60"/>
+              <w:left w:type="dxa" w:w="100"/>
+              <w:bottom w:type="dxa" w:w="60"/>
+              <w:right w:type="dxa" w:w="100"/>
+            </w:tcMar>
+          </w:tcPr>
+          <w:p>
+            <w:r>
+              <w:rPr>
+                <w:b w:val="false"/>
+                <w:bCs w:val="false"/>
+                <w:sz w:val="19"/>
+                <w:szCs w:val="19"/>
+              </w:rPr>
+              <w:t xml:space="preserve">cyber-forum brief (immediate 200 to caller) → APPROVAL → Jira issue</w:t>
+            </w:r>
+          </w:p>
+        </w:tc>
+      </w:tr>
+      <w:tr>
+        <w:tc>
+          <w:tcPr>
+            <w:tcW w:type="dxa" w:w="2400"/>
+            <w:tcMar>
+              <w:top w:type="dxa" w:w="60"/>
+              <w:left w:type="dxa" w:w="100"/>
+              <w:bottom w:type="dxa" w:w="60"/>
+              <w:right w:type="dxa" w:w="100"/>
+            </w:tcMar>
+          </w:tcPr>
+          <w:p>
+            <w:r>
+              <w:rPr>
+                <w:b w:val="false"/>
+                <w:bCs w:val="false"/>
+                <w:sz w:val="19"/>
+                <w:szCs w:val="19"/>
+              </w:rPr>
+              <w:t xml:space="preserve">scheduled-deepsearch</w:t>
+            </w:r>
+          </w:p>
+        </w:tc>
+        <w:tc>
+          <w:tcPr>
+            <w:tcW w:type="dxa" w:w="1800"/>
+            <w:tcMar>
+              <w:top w:type="dxa" w:w="60"/>
+              <w:left w:type="dxa" w:w="100"/>
+              <w:bottom w:type="dxa" w:w="60"/>
+              <w:right w:type="dxa" w:w="100"/>
+            </w:tcMar>
+          </w:tcPr>
+          <w:p>
+            <w:r>
+              <w:rPr>
+                <w:b w:val="false"/>
+                <w:bCs w:val="false"/>
+                <w:sz w:val="19"/>
+                <w:szCs w:val="19"/>
+              </w:rPr>
+              <w:t xml:space="preserve">Weekly</w:t>
+            </w:r>
+          </w:p>
+        </w:tc>
+        <w:tc>
+          <w:tcPr>
+            <w:tcW w:type="dxa" w:w="5160"/>
+            <w:tcMar>
+              <w:top w:type="dxa" w:w="60"/>
+              <w:left w:type="dxa" w:w="100"/>
+              <w:bottom w:type="dxa" w:w="60"/>
+              <w:right w:type="dxa" w:w="100"/>
+            </w:tcMar>
+          </w:tcPr>
+          <w:p>
+            <w:r>
+              <w:rPr>
+                <w:b w:val="false"/>
+                <w:bCs w:val="false"/>
+                <w:sz w:val="19"/>
+                <w:szCs w:val="19"/>
+              </w:rPr>
+              <w:t xml:space="preserve">Supplier watchlist (SharePoint) → deepsearch agent per supplier → APPROVAL → dashboard to SharePoint → low score? → APPROVAL → Jira ticket</w:t>
+            </w:r>
+          </w:p>
+        </w:tc>
+      </w:tr>
+      <w:tr>
+        <w:tc>
+          <w:tcPr>
+            <w:tcW w:type="dxa" w:w="2400"/>
+            <w:shd w:fill="E4F3F1" w:val="clear"/>
+            <w:tcMar>
+              <w:top w:type="dxa" w:w="60"/>
+              <w:left w:type="dxa" w:w="100"/>
+              <w:bottom w:type="dxa" w:w="60"/>
+              <w:right w:type="dxa" w:w="100"/>
+            </w:tcMar>
+          </w:tcPr>
+          <w:p>
+            <w:r>
+              <w:rPr>
+                <w:b w:val="false"/>
+                <w:bCs w:val="false"/>
+                <w:sz w:val="19"/>
+                <w:szCs w:val="19"/>
+              </w:rPr>
+              <w:t xml:space="preserve">jira-finding-sync</w:t>
+            </w:r>
+          </w:p>
+        </w:tc>
+        <w:tc>
+          <w:tcPr>
+            <w:tcW w:type="dxa" w:w="1800"/>
+            <w:shd w:fill="E4F3F1" w:val="clear"/>
+            <w:tcMar>
+              <w:top w:type="dxa" w:w="60"/>
+              <w:left w:type="dxa" w:w="100"/>
+              <w:bottom w:type="dxa" w:w="60"/>
+              <w:right w:type="dxa" w:w="100"/>
+            </w:tcMar>
+          </w:tcPr>
+          <w:p>
+            <w:r>
+              <w:rPr>
+                <w:b w:val="false"/>
+                <w:bCs w:val="false"/>
+                <w:sz w:val="19"/>
+                <w:szCs w:val="19"/>
+              </w:rPr>
+              <w:t xml:space="preserve">Hourly</w:t>
+            </w:r>
+          </w:p>
+        </w:tc>
+        <w:tc>
+          <w:tcPr>
+            <w:tcW w:type="dxa" w:w="5160"/>
+            <w:shd w:fill="E4F3F1" w:val="clear"/>
+            <w:tcMar>
+              <w:top w:type="dxa" w:w="60"/>
+              <w:left w:type="dxa" w:w="100"/>
+              <w:bottom w:type="dxa" w:w="60"/>
+              <w:right w:type="dxa" w:w="100"/>
+            </w:tcMar>
+          </w:tcPr>
+          <w:p>
+            <w:r>
+              <w:rPr>
+                <w:b w:val="false"/>
+                <w:bCs w:val="false"/>
+                <w:sz w:val="19"/>
+                <w:szCs w:val="19"/>
+              </w:rPr>
+              <w:t xml:space="preserve">JQL updated TPRM findings → APPROVAL → submit status to IAF API → Jira comment on failure</w:t>
+            </w:r>
+          </w:p>
+        </w:tc>
+      </w:tr>
+    </w:tbl>
+    <w:p>
+      <w:pPr>
+        <w:spacing w:after="200"/>
+      </w:pPr>
     </w:p>
     <w:p>
       <w:pPr>
@@ -4258,7 +4295,7 @@
         <w:jc w:val="both"/>
       </w:pPr>
       <w:r>
-        <w:t xml:space="preserve">Integrations are declared once in integrations/registry.json and attached per agent. Reads are broad within least-privilege scopes; writes are stripped from every agent tool and exist only inside the approval-gated workflows. Credentials live in Foundry connections backed by Key Vault; Graph integrations use dedicated Entra app registrations with admin-consented application permissions.</w:t>
+        <w:t xml:space="preserve">The complete release path for any deliverable, in or out of the workflows, is:</w:t>
       </w:r>
     </w:p>
     <w:p>
@@ -4269,7 +4306,7 @@
       <w:r>
         <w:drawing>
           <wp:inline distT="0" distB="0" distL="0" distR="0">
-            <wp:extent cx="5905500" cy="3571875"/>
+            <wp:extent cx="5905500" cy="3190875"/>
             <wp:effectExtent t="0" r="0" b="0" l="0"/>
             <wp:docPr id="1" name="" descr="" title=""/>
             <wp:cNvGraphicFramePr>
@@ -4294,7 +4331,7 @@
                   <pic:spPr bwMode="auto">
                     <a:xfrm>
                       <a:off x="0" y="0"/>
-                      <a:ext cx="5905500" cy="3571875"/>
+                      <a:ext cx="5905500" cy="3190875"/>
                     </a:xfrm>
                     <a:prstGeom prst="rect">
                       <a:avLst/>
@@ -4320,869 +4357,16 @@
           <w:sz w:val="18"/>
           <w:szCs w:val="18"/>
         </w:rPr>
-        <w:t xml:space="preserve">Figure 4 — Interconnection map across the Euronext technology stack</w:t>
-      </w:r>
-    </w:p>
-    <w:tbl>
-      <w:tblPr>
-        <w:tblW w:type="dxa" w:w="9360"/>
-        <w:tblBorders>
-          <w:top w:val="single" w:color="auto" w:sz="4"/>
-          <w:left w:val="single" w:color="auto" w:sz="4"/>
-          <w:bottom w:val="single" w:color="auto" w:sz="4"/>
-          <w:right w:val="single" w:color="auto" w:sz="4"/>
-          <w:insideH w:val="single" w:color="auto" w:sz="4"/>
-          <w:insideV w:val="single" w:color="auto" w:sz="4"/>
-        </w:tblBorders>
-      </w:tblPr>
-      <w:tblGrid>
-        <w:gridCol w:w="2300"/>
-        <w:gridCol w:w="2800"/>
-        <w:gridCol w:w="4260"/>
-      </w:tblGrid>
-      <w:tr>
-        <w:trPr>
-          <w:tblHeader/>
-        </w:trPr>
-        <w:tc>
-          <w:tcPr>
-            <w:tcW w:type="dxa" w:w="2300"/>
-            <w:shd w:fill="008D7F" w:val="clear"/>
-            <w:tcMar>
-              <w:top w:type="dxa" w:w="60"/>
-              <w:left w:type="dxa" w:w="100"/>
-              <w:bottom w:type="dxa" w:w="60"/>
-              <w:right w:type="dxa" w:w="100"/>
-            </w:tcMar>
-          </w:tcPr>
-          <w:p>
-            <w:r>
-              <w:rPr>
-                <w:b/>
-                <w:bCs/>
-                <w:color w:val="FFFFFF"/>
-                <w:sz w:val="19"/>
-                <w:szCs w:val="19"/>
-              </w:rPr>
-              <w:t xml:space="preserve">System</w:t>
-            </w:r>
-          </w:p>
-        </w:tc>
-        <w:tc>
-          <w:tcPr>
-            <w:tcW w:type="dxa" w:w="2800"/>
-            <w:shd w:fill="008D7F" w:val="clear"/>
-            <w:tcMar>
-              <w:top w:type="dxa" w:w="60"/>
-              <w:left w:type="dxa" w:w="100"/>
-              <w:bottom w:type="dxa" w:w="60"/>
-              <w:right w:type="dxa" w:w="100"/>
-            </w:tcMar>
-          </w:tcPr>
-          <w:p>
-            <w:r>
-              <w:rPr>
-                <w:b/>
-                <w:bCs/>
-                <w:color w:val="FFFFFF"/>
-                <w:sz w:val="19"/>
-                <w:szCs w:val="19"/>
-              </w:rPr>
-              <w:t xml:space="preserve">Used by</w:t>
-            </w:r>
-          </w:p>
-        </w:tc>
-        <w:tc>
-          <w:tcPr>
-            <w:tcW w:type="dxa" w:w="4260"/>
-            <w:shd w:fill="008D7F" w:val="clear"/>
-            <w:tcMar>
-              <w:top w:type="dxa" w:w="60"/>
-              <w:left w:type="dxa" w:w="100"/>
-              <w:bottom w:type="dxa" w:w="60"/>
-              <w:right w:type="dxa" w:w="100"/>
-            </w:tcMar>
-          </w:tcPr>
-          <w:p>
-            <w:r>
-              <w:rPr>
-                <w:b/>
-                <w:bCs/>
-                <w:color w:val="FFFFFF"/>
-                <w:sz w:val="19"/>
-                <w:szCs w:val="19"/>
-              </w:rPr>
-              <w:t xml:space="preserve">Purpose</w:t>
-            </w:r>
-          </w:p>
-        </w:tc>
-      </w:tr>
-      <w:tr>
-        <w:tc>
-          <w:tcPr>
-            <w:tcW w:type="dxa" w:w="2300"/>
-            <w:tcMar>
-              <w:top w:type="dxa" w:w="60"/>
-              <w:left w:type="dxa" w:w="100"/>
-              <w:bottom w:type="dxa" w:w="60"/>
-              <w:right w:type="dxa" w:w="100"/>
-            </w:tcMar>
-          </w:tcPr>
-          <w:p>
-            <w:r>
-              <w:rPr>
-                <w:b w:val="false"/>
-                <w:bCs w:val="false"/>
-                <w:sz w:val="19"/>
-                <w:szCs w:val="19"/>
-              </w:rPr>
-              <w:t xml:space="preserve">Jira Cloud</w:t>
-            </w:r>
-          </w:p>
-        </w:tc>
-        <w:tc>
-          <w:tcPr>
-            <w:tcW w:type="dxa" w:w="2800"/>
-            <w:tcMar>
-              <w:top w:type="dxa" w:w="60"/>
-              <w:left w:type="dxa" w:w="100"/>
-              <w:bottom w:type="dxa" w:w="60"/>
-              <w:right w:type="dxa" w:w="100"/>
-            </w:tcMar>
-          </w:tcPr>
-          <w:p>
-            <w:r>
-              <w:rPr>
-                <w:b w:val="false"/>
-                <w:bCs w:val="false"/>
-                <w:sz w:val="19"/>
-                <w:szCs w:val="19"/>
-              </w:rPr>
-              <w:t xml:space="preserve">cyber-forum, ciso-reporting</w:t>
-            </w:r>
-          </w:p>
-        </w:tc>
-        <w:tc>
-          <w:tcPr>
-            <w:tcW w:type="dxa" w:w="4260"/>
-            <w:tcMar>
-              <w:top w:type="dxa" w:w="60"/>
-              <w:left w:type="dxa" w:w="100"/>
-              <w:bottom w:type="dxa" w:w="60"/>
-              <w:right w:type="dxa" w:w="100"/>
-            </w:tcMar>
-          </w:tcPr>
-          <w:p>
-            <w:r>
-              <w:rPr>
-                <w:b w:val="false"/>
-                <w:bCs w:val="false"/>
-                <w:sz w:val="19"/>
-                <w:szCs w:val="19"/>
-              </w:rPr>
-              <w:t xml:space="preserve">Remediation and finding tickets; JQL queries</w:t>
-            </w:r>
-          </w:p>
-        </w:tc>
-      </w:tr>
-      <w:tr>
-        <w:tc>
-          <w:tcPr>
-            <w:tcW w:type="dxa" w:w="2300"/>
-            <w:tcMar>
-              <w:top w:type="dxa" w:w="60"/>
-              <w:left w:type="dxa" w:w="100"/>
-              <w:bottom w:type="dxa" w:w="60"/>
-              <w:right w:type="dxa" w:w="100"/>
-            </w:tcMar>
-          </w:tcPr>
-          <w:p>
-            <w:r>
-              <w:rPr>
-                <w:b w:val="false"/>
-                <w:bCs w:val="false"/>
-                <w:sz w:val="19"/>
-                <w:szCs w:val="19"/>
-              </w:rPr>
-              <w:t xml:space="preserve">Jira Assets (CMDB)</w:t>
-            </w:r>
-          </w:p>
-        </w:tc>
-        <w:tc>
-          <w:tcPr>
-            <w:tcW w:type="dxa" w:w="2800"/>
-            <w:tcMar>
-              <w:top w:type="dxa" w:w="60"/>
-              <w:left w:type="dxa" w:w="100"/>
-              <w:bottom w:type="dxa" w:w="60"/>
-              <w:right w:type="dxa" w:w="100"/>
-            </w:tcMar>
-          </w:tcPr>
-          <w:p>
-            <w:r>
-              <w:rPr>
-                <w:b w:val="false"/>
-                <w:bCs w:val="false"/>
-                <w:sz w:val="19"/>
-                <w:szCs w:val="19"/>
-              </w:rPr>
-              <w:t xml:space="preserve">dora, tpsrca-engine</w:t>
-            </w:r>
-          </w:p>
-        </w:tc>
-        <w:tc>
-          <w:tcPr>
-            <w:tcW w:type="dxa" w:w="4260"/>
-            <w:tcMar>
-              <w:top w:type="dxa" w:w="60"/>
-              <w:left w:type="dxa" w:w="100"/>
-              <w:bottom w:type="dxa" w:w="60"/>
-              <w:right w:type="dxa" w:w="100"/>
-            </w:tcMar>
-          </w:tcPr>
-          <w:p>
-            <w:r>
-              <w:rPr>
-                <w:b w:val="false"/>
-                <w:bCs w:val="false"/>
-                <w:sz w:val="19"/>
-                <w:szCs w:val="19"/>
-              </w:rPr>
-              <w:t xml:space="preserve">CI/supplier/service records for the DORA Register of Information and concentration risk</w:t>
-            </w:r>
-          </w:p>
-        </w:tc>
-      </w:tr>
-      <w:tr>
-        <w:tc>
-          <w:tcPr>
-            <w:tcW w:type="dxa" w:w="2300"/>
-            <w:tcMar>
-              <w:top w:type="dxa" w:w="60"/>
-              <w:left w:type="dxa" w:w="100"/>
-              <w:bottom w:type="dxa" w:w="60"/>
-              <w:right w:type="dxa" w:w="100"/>
-            </w:tcMar>
-          </w:tcPr>
-          <w:p>
-            <w:r>
-              <w:rPr>
-                <w:b w:val="false"/>
-                <w:bCs w:val="false"/>
-                <w:sz w:val="19"/>
-                <w:szCs w:val="19"/>
-              </w:rPr>
-              <w:t xml:space="preserve">OneTrust</w:t>
-            </w:r>
-          </w:p>
-        </w:tc>
-        <w:tc>
-          <w:tcPr>
-            <w:tcW w:type="dxa" w:w="2800"/>
-            <w:tcMar>
-              <w:top w:type="dxa" w:w="60"/>
-              <w:left w:type="dxa" w:w="100"/>
-              <w:bottom w:type="dxa" w:w="60"/>
-              <w:right w:type="dxa" w:w="100"/>
-            </w:tcMar>
-          </w:tcPr>
-          <w:p>
-            <w:r>
-              <w:rPr>
-                <w:b w:val="false"/>
-                <w:bCs w:val="false"/>
-                <w:sz w:val="19"/>
-                <w:szCs w:val="19"/>
-              </w:rPr>
-              <w:t xml:space="preserve">dpia, form-b, ciso-reporting/summary</w:t>
-            </w:r>
-          </w:p>
-        </w:tc>
-        <w:tc>
-          <w:tcPr>
-            <w:tcW w:type="dxa" w:w="4260"/>
-            <w:tcMar>
-              <w:top w:type="dxa" w:w="60"/>
-              <w:left w:type="dxa" w:w="100"/>
-              <w:bottom w:type="dxa" w:w="60"/>
-              <w:right w:type="dxa" w:w="100"/>
-            </w:tcMar>
-          </w:tcPr>
-          <w:p>
-            <w:r>
-              <w:rPr>
-                <w:b w:val="false"/>
-                <w:bCs w:val="false"/>
-                <w:sz w:val="19"/>
-                <w:szCs w:val="19"/>
-              </w:rPr>
-              <w:t xml:space="preserve">Assessment and vendor-inventory retrieval, replacing manual PDF hand-off</w:t>
-            </w:r>
-          </w:p>
-        </w:tc>
-      </w:tr>
-      <w:tr>
-        <w:tc>
-          <w:tcPr>
-            <w:tcW w:type="dxa" w:w="2300"/>
-            <w:tcMar>
-              <w:top w:type="dxa" w:w="60"/>
-              <w:left w:type="dxa" w:w="100"/>
-              <w:bottom w:type="dxa" w:w="60"/>
-              <w:right w:type="dxa" w:w="100"/>
-            </w:tcMar>
-          </w:tcPr>
-          <w:p>
-            <w:r>
-              <w:rPr>
-                <w:b w:val="false"/>
-                <w:bCs w:val="false"/>
-                <w:sz w:val="19"/>
-                <w:szCs w:val="19"/>
-              </w:rPr>
-              <w:t xml:space="preserve">SecurityScorecard</w:t>
-            </w:r>
-          </w:p>
-        </w:tc>
-        <w:tc>
-          <w:tcPr>
-            <w:tcW w:type="dxa" w:w="2800"/>
-            <w:tcMar>
-              <w:top w:type="dxa" w:w="60"/>
-              <w:left w:type="dxa" w:w="100"/>
-              <w:bottom w:type="dxa" w:w="60"/>
-              <w:right w:type="dxa" w:w="100"/>
-            </w:tcMar>
-          </w:tcPr>
-          <w:p>
-            <w:r>
-              <w:rPr>
-                <w:b w:val="false"/>
-                <w:bCs w:val="false"/>
-                <w:sz w:val="19"/>
-                <w:szCs w:val="19"/>
-              </w:rPr>
-              <w:t xml:space="preserve">deepsearch agents, tpsrca</w:t>
-            </w:r>
-          </w:p>
-        </w:tc>
-        <w:tc>
-          <w:tcPr>
-            <w:tcW w:type="dxa" w:w="4260"/>
-            <w:tcMar>
-              <w:top w:type="dxa" w:w="60"/>
-              <w:left w:type="dxa" w:w="100"/>
-              <w:bottom w:type="dxa" w:w="60"/>
-              <w:right w:type="dxa" w:w="100"/>
-            </w:tcMar>
-          </w:tcPr>
-          <w:p>
-            <w:r>
-              <w:rPr>
-                <w:b w:val="false"/>
-                <w:bCs w:val="false"/>
-                <w:sz w:val="19"/>
-                <w:szCs w:val="19"/>
-              </w:rPr>
-              <w:t xml:space="preserve">External security-rating evidence</w:t>
-            </w:r>
-          </w:p>
-        </w:tc>
-      </w:tr>
-      <w:tr>
-        <w:tc>
-          <w:tcPr>
-            <w:tcW w:type="dxa" w:w="2300"/>
-            <w:tcMar>
-              <w:top w:type="dxa" w:w="60"/>
-              <w:left w:type="dxa" w:w="100"/>
-              <w:bottom w:type="dxa" w:w="60"/>
-              <w:right w:type="dxa" w:w="100"/>
-            </w:tcMar>
-          </w:tcPr>
-          <w:p>
-            <w:r>
-              <w:rPr>
-                <w:b w:val="false"/>
-                <w:bCs w:val="false"/>
-                <w:sz w:val="19"/>
-                <w:szCs w:val="19"/>
-              </w:rPr>
-              <w:t xml:space="preserve">Microsoft Defender (Graph)</w:t>
-            </w:r>
-          </w:p>
-        </w:tc>
-        <w:tc>
-          <w:tcPr>
-            <w:tcW w:type="dxa" w:w="2800"/>
-            <w:tcMar>
-              <w:top w:type="dxa" w:w="60"/>
-              <w:left w:type="dxa" w:w="100"/>
-              <w:bottom w:type="dxa" w:w="60"/>
-              <w:right w:type="dxa" w:w="100"/>
-            </w:tcMar>
-          </w:tcPr>
-          <w:p>
-            <w:r>
-              <w:rPr>
-                <w:b w:val="false"/>
-                <w:bCs w:val="false"/>
-                <w:sz w:val="19"/>
-                <w:szCs w:val="19"/>
-              </w:rPr>
-              <w:t xml:space="preserve">cyber-forum</w:t>
-            </w:r>
-          </w:p>
-        </w:tc>
-        <w:tc>
-          <w:tcPr>
-            <w:tcW w:type="dxa" w:w="4260"/>
-            <w:tcMar>
-              <w:top w:type="dxa" w:w="60"/>
-              <w:left w:type="dxa" w:w="100"/>
-              <w:bottom w:type="dxa" w:w="60"/>
-              <w:right w:type="dxa" w:w="100"/>
-            </w:tcMar>
-          </w:tcPr>
-          <w:p>
-            <w:r>
-              <w:rPr>
-                <w:b w:val="false"/>
-                <w:bCs w:val="false"/>
-                <w:sz w:val="19"/>
-                <w:szCs w:val="19"/>
-              </w:rPr>
-              <w:t xml:space="preserve">Incidents, alerts, KQL hunting, Secure Score for threat briefs</w:t>
-            </w:r>
-          </w:p>
-        </w:tc>
-      </w:tr>
-      <w:tr>
-        <w:tc>
-          <w:tcPr>
-            <w:tcW w:type="dxa" w:w="2300"/>
-            <w:tcMar>
-              <w:top w:type="dxa" w:w="60"/>
-              <w:left w:type="dxa" w:w="100"/>
-              <w:bottom w:type="dxa" w:w="60"/>
-              <w:right w:type="dxa" w:w="100"/>
-            </w:tcMar>
-          </w:tcPr>
-          <w:p>
-            <w:r>
-              <w:rPr>
-                <w:b w:val="false"/>
-                <w:bCs w:val="false"/>
-                <w:sz w:val="19"/>
-                <w:szCs w:val="19"/>
-              </w:rPr>
-              <w:t xml:space="preserve">SharePoint (Graph)</w:t>
-            </w:r>
-          </w:p>
-        </w:tc>
-        <w:tc>
-          <w:tcPr>
-            <w:tcW w:type="dxa" w:w="2800"/>
-            <w:tcMar>
-              <w:top w:type="dxa" w:w="60"/>
-              <w:left w:type="dxa" w:w="100"/>
-              <w:bottom w:type="dxa" w:w="60"/>
-              <w:right w:type="dxa" w:w="100"/>
-            </w:tcMar>
-          </w:tcPr>
-          <w:p>
-            <w:r>
-              <w:rPr>
-                <w:b w:val="false"/>
-                <w:bCs w:val="false"/>
-                <w:sz w:val="19"/>
-                <w:szCs w:val="19"/>
-              </w:rPr>
-              <w:t xml:space="preserve">document and reporting agents</w:t>
-            </w:r>
-          </w:p>
-        </w:tc>
-        <w:tc>
-          <w:tcPr>
-            <w:tcW w:type="dxa" w:w="4260"/>
-            <w:tcMar>
-              <w:top w:type="dxa" w:w="60"/>
-              <w:left w:type="dxa" w:w="100"/>
-              <w:bottom w:type="dxa" w:w="60"/>
-              <w:right w:type="dxa" w:w="100"/>
-            </w:tcMar>
-          </w:tcPr>
-          <w:p>
-            <w:r>
-              <w:rPr>
-                <w:b w:val="false"/>
-                <w:bCs w:val="false"/>
-                <w:sz w:val="19"/>
-                <w:szCs w:val="19"/>
-              </w:rPr>
-              <w:t xml:space="preserve">Evidence repository reads; publishing generated deliverables</w:t>
-            </w:r>
-          </w:p>
-        </w:tc>
-      </w:tr>
-      <w:tr>
-        <w:tc>
-          <w:tcPr>
-            <w:tcW w:type="dxa" w:w="2300"/>
-            <w:tcMar>
-              <w:top w:type="dxa" w:w="60"/>
-              <w:left w:type="dxa" w:w="100"/>
-              <w:bottom w:type="dxa" w:w="60"/>
-              <w:right w:type="dxa" w:w="100"/>
-            </w:tcMar>
-          </w:tcPr>
-          <w:p>
-            <w:r>
-              <w:rPr>
-                <w:b w:val="false"/>
-                <w:bCs w:val="false"/>
-                <w:sz w:val="19"/>
-                <w:szCs w:val="19"/>
-              </w:rPr>
-              <w:t xml:space="preserve">IAF API (template)</w:t>
-            </w:r>
-          </w:p>
-        </w:tc>
-        <w:tc>
-          <w:tcPr>
-            <w:tcW w:type="dxa" w:w="2800"/>
-            <w:tcMar>
-              <w:top w:type="dxa" w:w="60"/>
-              <w:left w:type="dxa" w:w="100"/>
-              <w:bottom w:type="dxa" w:w="60"/>
-              <w:right w:type="dxa" w:w="100"/>
-            </w:tcMar>
-          </w:tcPr>
-          <w:p>
-            <w:r>
-              <w:rPr>
-                <w:b w:val="false"/>
-                <w:bCs w:val="false"/>
-                <w:sz w:val="19"/>
-                <w:szCs w:val="19"/>
-              </w:rPr>
-              <w:t xml:space="preserve">dpia, dora, deepsearch, tpsrca</w:t>
-            </w:r>
-          </w:p>
-        </w:tc>
-        <w:tc>
-          <w:tcPr>
-            <w:tcW w:type="dxa" w:w="4260"/>
-            <w:tcMar>
-              <w:top w:type="dxa" w:w="60"/>
-              <w:left w:type="dxa" w:w="100"/>
-              <w:bottom w:type="dxa" w:w="60"/>
-              <w:right w:type="dxa" w:w="100"/>
-            </w:tcMar>
-          </w:tcPr>
-          <w:p>
-            <w:r>
-              <w:rPr>
-                <w:b w:val="false"/>
-                <w:bCs w:val="false"/>
-                <w:sz w:val="19"/>
-                <w:szCs w:val="19"/>
-              </w:rPr>
-              <w:t xml:space="preserve">Internal assurance framework; align template to the internal spec before use</w:t>
-            </w:r>
-          </w:p>
-        </w:tc>
-      </w:tr>
-      <w:tr>
-        <w:tc>
-          <w:tcPr>
-            <w:tcW w:type="dxa" w:w="2300"/>
-            <w:tcMar>
-              <w:top w:type="dxa" w:w="60"/>
-              <w:left w:type="dxa" w:w="100"/>
-              <w:bottom w:type="dxa" w:w="60"/>
-              <w:right w:type="dxa" w:w="100"/>
-            </w:tcMar>
-          </w:tcPr>
-          <w:p>
-            <w:r>
-              <w:rPr>
-                <w:b w:val="false"/>
-                <w:bCs w:val="false"/>
-                <w:sz w:val="19"/>
-                <w:szCs w:val="19"/>
-              </w:rPr>
-              <w:t xml:space="preserve">ENX Gateway MCP (template)</w:t>
-            </w:r>
-          </w:p>
-        </w:tc>
-        <w:tc>
-          <w:tcPr>
-            <w:tcW w:type="dxa" w:w="2800"/>
-            <w:tcMar>
-              <w:top w:type="dxa" w:w="60"/>
-              <w:left w:type="dxa" w:w="100"/>
-              <w:bottom w:type="dxa" w:w="60"/>
-              <w:right w:type="dxa" w:w="100"/>
-            </w:tcMar>
-          </w:tcPr>
-          <w:p>
-            <w:r>
-              <w:rPr>
-                <w:b w:val="false"/>
-                <w:bCs w:val="false"/>
-                <w:sz w:val="19"/>
-                <w:szCs w:val="19"/>
-              </w:rPr>
-              <w:t xml:space="preserve">control-center, deepsearch, cyber-forum</w:t>
-            </w:r>
-          </w:p>
-        </w:tc>
-        <w:tc>
-          <w:tcPr>
-            <w:tcW w:type="dxa" w:w="4260"/>
-            <w:tcMar>
-              <w:top w:type="dxa" w:w="60"/>
-              <w:left w:type="dxa" w:w="100"/>
-              <w:bottom w:type="dxa" w:w="60"/>
-              <w:right w:type="dxa" w:w="100"/>
-            </w:tcMar>
-          </w:tcPr>
-          <w:p>
-            <w:r>
-              <w:rPr>
-                <w:b w:val="false"/>
-                <w:bCs w:val="false"/>
-                <w:sz w:val="19"/>
-                <w:szCs w:val="19"/>
-              </w:rPr>
-              <w:t xml:space="preserve">Internal gateway tools; fill server URL and allowlist from the gateway listing</w:t>
-            </w:r>
-          </w:p>
-        </w:tc>
-      </w:tr>
-      <w:tr>
-        <w:tc>
-          <w:tcPr>
-            <w:tcW w:type="dxa" w:w="2300"/>
-            <w:tcMar>
-              <w:top w:type="dxa" w:w="60"/>
-              <w:left w:type="dxa" w:w="100"/>
-              <w:bottom w:type="dxa" w:w="60"/>
-              <w:right w:type="dxa" w:w="100"/>
-            </w:tcMar>
-          </w:tcPr>
-          <w:p>
-            <w:r>
-              <w:rPr>
-                <w:b w:val="false"/>
-                <w:bCs w:val="false"/>
-                <w:sz w:val="19"/>
-                <w:szCs w:val="19"/>
-              </w:rPr>
-              <w:t xml:space="preserve">Bing web search</w:t>
-            </w:r>
-          </w:p>
-        </w:tc>
-        <w:tc>
-          <w:tcPr>
-            <w:tcW w:type="dxa" w:w="2800"/>
-            <w:tcMar>
-              <w:top w:type="dxa" w:w="60"/>
-              <w:left w:type="dxa" w:w="100"/>
-              <w:bottom w:type="dxa" w:w="60"/>
-              <w:right w:type="dxa" w:w="100"/>
-            </w:tcMar>
-          </w:tcPr>
-          <w:p>
-            <w:r>
-              <w:rPr>
-                <w:b w:val="false"/>
-                <w:bCs w:val="false"/>
-                <w:sz w:val="19"/>
-                <w:szCs w:val="19"/>
-              </w:rPr>
-              <w:t xml:space="preserve">research and regulatory agents</w:t>
-            </w:r>
-          </w:p>
-        </w:tc>
-        <w:tc>
-          <w:tcPr>
-            <w:tcW w:type="dxa" w:w="4260"/>
-            <w:tcMar>
-              <w:top w:type="dxa" w:w="60"/>
-              <w:left w:type="dxa" w:w="100"/>
-              <w:bottom w:type="dxa" w:w="60"/>
-              <w:right w:type="dxa" w:w="100"/>
-            </w:tcMar>
-          </w:tcPr>
-          <w:p>
-            <w:r>
-              <w:rPr>
-                <w:b w:val="false"/>
-                <w:bCs w:val="false"/>
-                <w:sz w:val="19"/>
-                <w:szCs w:val="19"/>
-              </w:rPr>
-              <w:t xml:space="preserve">Grounded, cited web research</w:t>
-            </w:r>
-          </w:p>
-        </w:tc>
-      </w:tr>
-      <w:tr>
-        <w:tc>
-          <w:tcPr>
-            <w:tcW w:type="dxa" w:w="2300"/>
-            <w:tcMar>
-              <w:top w:type="dxa" w:w="60"/>
-              <w:left w:type="dxa" w:w="100"/>
-              <w:bottom w:type="dxa" w:w="60"/>
-              <w:right w:type="dxa" w:w="100"/>
-            </w:tcMar>
-          </w:tcPr>
-          <w:p>
-            <w:r>
-              <w:rPr>
-                <w:b w:val="false"/>
-                <w:bCs w:val="false"/>
-                <w:sz w:val="19"/>
-                <w:szCs w:val="19"/>
-              </w:rPr>
-              <w:t xml:space="preserve">Microsoft 365 Copilot</w:t>
-            </w:r>
-          </w:p>
-        </w:tc>
-        <w:tc>
-          <w:tcPr>
-            <w:tcW w:type="dxa" w:w="2800"/>
-            <w:tcMar>
-              <w:top w:type="dxa" w:w="60"/>
-              <w:left w:type="dxa" w:w="100"/>
-              <w:bottom w:type="dxa" w:w="60"/>
-              <w:right w:type="dxa" w:w="100"/>
-            </w:tcMar>
-          </w:tcPr>
-          <w:p>
-            <w:r>
-              <w:rPr>
-                <w:b w:val="false"/>
-                <w:bCs w:val="false"/>
-                <w:sz w:val="19"/>
-                <w:szCs w:val="19"/>
-              </w:rPr>
-              <w:t xml:space="preserve">Q&amp;A agents</w:t>
-            </w:r>
-          </w:p>
-        </w:tc>
-        <w:tc>
-          <w:tcPr>
-            <w:tcW w:type="dxa" w:w="4260"/>
-            <w:tcMar>
-              <w:top w:type="dxa" w:w="60"/>
-              <w:left w:type="dxa" w:w="100"/>
-              <w:bottom w:type="dxa" w:w="60"/>
-              <w:right w:type="dxa" w:w="100"/>
-            </w:tcMar>
-          </w:tcPr>
-          <w:p>
-            <w:r>
-              <w:rPr>
-                <w:b w:val="false"/>
-                <w:bCs w:val="false"/>
-                <w:sz w:val="19"/>
-                <w:szCs w:val="19"/>
-              </w:rPr>
-              <w:t xml:space="preserve">Team-member access from Teams/Copilot chat</w:t>
-            </w:r>
-          </w:p>
-        </w:tc>
-      </w:tr>
-    </w:tbl>
+        <w:t xml:space="preserve">Figure 3 — Release path: reflexive self-check → independent verifier → human approval → gated submission</w:t>
+      </w:r>
+    </w:p>
     <w:p>
       <w:pPr>
         <w:pStyle w:val="Heading1"/>
         <w:spacing w:after="160" w:before="360"/>
       </w:pPr>
       <w:r>
-        <w:t xml:space="preserve">11. Security and Governance</w:t>
-      </w:r>
-    </w:p>
-    <w:p>
-      <w:pPr>
-        <w:pStyle w:val="Heading2"/>
-        <w:spacing w:after="120" w:before="260"/>
-      </w:pPr>
-      <w:r>
-        <w:t xml:space="preserve">11.1 Human approval — three enforced layers</w:t>
-      </w:r>
-    </w:p>
-    <w:p>
-      <w:pPr>
-        <w:pStyle w:val="ListParagraph"/>
-        <w:numPr>
-          <w:ilvl w:val="0"/>
-          <w:numId w:val="2"/>
-        </w:numPr>
-        <w:spacing w:after="80"/>
-      </w:pPr>
-      <w:r>
-        <w:rPr>
-          <w:b/>
-          <w:bCs/>
-        </w:rPr>
-        <w:t xml:space="preserve">Layer 1 (technical): </w:t>
-      </w:r>
-      <w:r>
-        <w:t xml:space="preserve">agents hold read-only tools — non-GET operations are stripped before attachment; write grants default to zero and any grant is a reviewable repository diff.</w:t>
-      </w:r>
-    </w:p>
-    <w:p>
-      <w:pPr>
-        <w:pStyle w:val="ListParagraph"/>
-        <w:numPr>
-          <w:ilvl w:val="0"/>
-          <w:numId w:val="2"/>
-        </w:numPr>
-        <w:spacing w:after="80"/>
-      </w:pPr>
-      <w:r>
-        <w:rPr>
-          <w:b/>
-          <w:bCs/>
-        </w:rPr>
-        <w:t xml:space="preserve">Layer 2 (behavioural): </w:t>
-      </w:r>
-      <w:r>
-        <w:t xml:space="preserve">every agent's instructions end with an injection-resistant APPROVAL GATE: complete draft, explicit 'approved' in-conversation, edit requests restart the cycle; nothing in retrieved documents or tool output can waive it.</w:t>
-      </w:r>
-    </w:p>
-    <w:p>
-      <w:pPr>
-        <w:pStyle w:val="ListParagraph"/>
-        <w:numPr>
-          <w:ilvl w:val="0"/>
-          <w:numId w:val="2"/>
-        </w:numPr>
-        <w:spacing w:after="80"/>
-      </w:pPr>
-      <w:r>
-        <w:rPr>
-          <w:b/>
-          <w:bCs/>
-        </w:rPr>
-        <w:t xml:space="preserve">Layer 3 (procedural): </w:t>
-      </w:r>
-      <w:r>
-        <w:t xml:space="preserve">workflow submissions suspend on approval webhooks with 3-day expiry; rejections are recorded, never submitted.</w:t>
-      </w:r>
-    </w:p>
-    <w:p>
-      <w:pPr>
-        <w:pStyle w:val="Heading2"/>
-        <w:spacing w:after="120" w:before="260"/>
-      </w:pPr>
-      <w:r>
-        <w:t xml:space="preserve">11.2 Verification before approval</w:t>
+        <w:t xml:space="preserve">10. Interconnections and Integrations</w:t>
       </w:r>
     </w:p>
     <w:p>
@@ -5191,391 +4375,7 @@
         <w:jc w:val="both"/>
       </w:pPr>
       <w:r>
-        <w:t xml:space="preserve">The output-verifier checks each deliverable draft against deterministic rules — section completeness per deliverable type, score/threshold consistency (TPRM High ≥ 7.0 / Medium ≥ 4.0; slide colour bands red ≥ 5.5 / amber ≥ 4.0), citation presence for regulatory claims, no residual placeholders, data minimisation, and approval-gate integrity — returning a strict PASS/FAIL with findings. A FAIL returns the draft to the producing agent (at most twice) before escalation.</w:t>
-      </w:r>
-    </w:p>
-    <w:p>
-      <w:pPr>
-        <w:pStyle w:val="Heading2"/>
-        <w:spacing w:after="120" w:before="260"/>
-      </w:pPr>
-      <w:r>
-        <w:t xml:space="preserve">11.3 Platform security</w:t>
-      </w:r>
-    </w:p>
-    <w:p>
-      <w:pPr>
-        <w:pStyle w:val="ListParagraph"/>
-        <w:numPr>
-          <w:ilvl w:val="0"/>
-          <w:numId w:val="2"/>
-        </w:numPr>
-        <w:spacing w:after="80"/>
-      </w:pPr>
-      <w:r>
-        <w:t xml:space="preserve">Entra-only authentication (local auth disabled on the Foundry account); RBAC via the Azure AI User role; managed identities for workflows and hosted MCP.</w:t>
-      </w:r>
-    </w:p>
-    <w:p>
-      <w:pPr>
-        <w:pStyle w:val="ListParagraph"/>
-        <w:numPr>
-          <w:ilvl w:val="0"/>
-          <w:numId w:val="2"/>
-        </w:numPr>
-        <w:spacing w:after="80"/>
-      </w:pPr>
-      <w:r>
-        <w:t xml:space="preserve">Secrets exclusively in Key Vault-backed connections; the repository contains placeholders only (verified by secret scan).</w:t>
-      </w:r>
-    </w:p>
-    <w:p>
-      <w:pPr>
-        <w:pStyle w:val="ListParagraph"/>
-        <w:numPr>
-          <w:ilvl w:val="0"/>
-          <w:numId w:val="2"/>
-        </w:numPr>
-        <w:spacing w:after="80"/>
-      </w:pPr>
-      <w:r>
-        <w:t xml:space="preserve">Azure AI content filtering applies to both model deployments; App Insights traces every run for audit; Log Analytics retention aligned to the ISMS (90 days, adjustable).</w:t>
-      </w:r>
-    </w:p>
-    <w:p>
-      <w:pPr>
-        <w:pStyle w:val="ListParagraph"/>
-        <w:numPr>
-          <w:ilvl w:val="0"/>
-          <w:numId w:val="2"/>
-        </w:numPr>
-        <w:spacing w:after="80"/>
-      </w:pPr>
-      <w:r>
-        <w:t xml:space="preserve">Public network access is enabled for the pilot and should move to private endpoints for production (parameterised in the Bicep).</w:t>
-      </w:r>
-    </w:p>
-    <w:p>
-      <w:pPr>
-        <w:pStyle w:val="Heading2"/>
-        <w:spacing w:after="120" w:before="260"/>
-      </w:pPr>
-      <w:r>
-        <w:t xml:space="preserve">11.4 Compliance position</w:t>
-      </w:r>
-    </w:p>
-    <w:tbl>
-      <w:tblPr>
-        <w:tblW w:type="dxa" w:w="9360"/>
-        <w:tblBorders>
-          <w:top w:val="single" w:color="auto" w:sz="4"/>
-          <w:left w:val="single" w:color="auto" w:sz="4"/>
-          <w:bottom w:val="single" w:color="auto" w:sz="4"/>
-          <w:right w:val="single" w:color="auto" w:sz="4"/>
-          <w:insideH w:val="single" w:color="auto" w:sz="4"/>
-          <w:insideV w:val="single" w:color="auto" w:sz="4"/>
-        </w:tblBorders>
-      </w:tblPr>
-      <w:tblGrid>
-        <w:gridCol w:w="3400"/>
-        <w:gridCol w:w="5960"/>
-      </w:tblGrid>
-      <w:tr>
-        <w:trPr>
-          <w:tblHeader/>
-        </w:trPr>
-        <w:tc>
-          <w:tcPr>
-            <w:tcW w:type="dxa" w:w="3400"/>
-            <w:shd w:fill="008D7F" w:val="clear"/>
-            <w:tcMar>
-              <w:top w:type="dxa" w:w="60"/>
-              <w:left w:type="dxa" w:w="100"/>
-              <w:bottom w:type="dxa" w:w="60"/>
-              <w:right w:type="dxa" w:w="100"/>
-            </w:tcMar>
-          </w:tcPr>
-          <w:p>
-            <w:r>
-              <w:rPr>
-                <w:b/>
-                <w:bCs/>
-                <w:color w:val="FFFFFF"/>
-                <w:sz w:val="19"/>
-                <w:szCs w:val="19"/>
-              </w:rPr>
-              <w:t xml:space="preserve">Obligation</w:t>
-            </w:r>
-          </w:p>
-        </w:tc>
-        <w:tc>
-          <w:tcPr>
-            <w:tcW w:type="dxa" w:w="5960"/>
-            <w:shd w:fill="008D7F" w:val="clear"/>
-            <w:tcMar>
-              <w:top w:type="dxa" w:w="60"/>
-              <w:left w:type="dxa" w:w="100"/>
-              <w:bottom w:type="dxa" w:w="60"/>
-              <w:right w:type="dxa" w:w="100"/>
-            </w:tcMar>
-          </w:tcPr>
-          <w:p>
-            <w:r>
-              <w:rPr>
-                <w:b/>
-                <w:bCs/>
-                <w:color w:val="FFFFFF"/>
-                <w:sz w:val="19"/>
-                <w:szCs w:val="19"/>
-              </w:rPr>
-              <w:t xml:space="preserve">How it is met</w:t>
-            </w:r>
-          </w:p>
-        </w:tc>
-      </w:tr>
-      <w:tr>
-        <w:tc>
-          <w:tcPr>
-            <w:tcW w:type="dxa" w:w="3400"/>
-            <w:tcMar>
-              <w:top w:type="dxa" w:w="60"/>
-              <w:left w:type="dxa" w:w="100"/>
-              <w:bottom w:type="dxa" w:w="60"/>
-              <w:right w:type="dxa" w:w="100"/>
-            </w:tcMar>
-          </w:tcPr>
-          <w:p>
-            <w:r>
-              <w:rPr>
-                <w:b w:val="false"/>
-                <w:bCs w:val="false"/>
-                <w:sz w:val="19"/>
-                <w:szCs w:val="19"/>
-              </w:rPr>
-              <w:t xml:space="preserve">EU AI Act Art. 14 (human oversight)</w:t>
-            </w:r>
-          </w:p>
-        </w:tc>
-        <w:tc>
-          <w:tcPr>
-            <w:tcW w:type="dxa" w:w="5960"/>
-            <w:tcMar>
-              <w:top w:type="dxa" w:w="60"/>
-              <w:left w:type="dxa" w:w="100"/>
-              <w:bottom w:type="dxa" w:w="60"/>
-              <w:right w:type="dxa" w:w="100"/>
-            </w:tcMar>
-          </w:tcPr>
-          <w:p>
-            <w:r>
-              <w:rPr>
-                <w:b w:val="false"/>
-                <w:bCs w:val="false"/>
-                <w:sz w:val="19"/>
-                <w:szCs w:val="19"/>
-              </w:rPr>
-              <w:t xml:space="preserve">The three-layer approval control: outputs take effect only after natural-person review; workflow run history is the evidence</w:t>
-            </w:r>
-          </w:p>
-        </w:tc>
-      </w:tr>
-      <w:tr>
-        <w:tc>
-          <w:tcPr>
-            <w:tcW w:type="dxa" w:w="3400"/>
-            <w:tcMar>
-              <w:top w:type="dxa" w:w="60"/>
-              <w:left w:type="dxa" w:w="100"/>
-              <w:bottom w:type="dxa" w:w="60"/>
-              <w:right w:type="dxa" w:w="100"/>
-            </w:tcMar>
-          </w:tcPr>
-          <w:p>
-            <w:r>
-              <w:rPr>
-                <w:b w:val="false"/>
-                <w:bCs w:val="false"/>
-                <w:sz w:val="19"/>
-                <w:szCs w:val="19"/>
-              </w:rPr>
-              <w:t xml:space="preserve">EU AI Act deployer duties</w:t>
-            </w:r>
-          </w:p>
-        </w:tc>
-        <w:tc>
-          <w:tcPr>
-            <w:tcW w:type="dxa" w:w="5960"/>
-            <w:tcMar>
-              <w:top w:type="dxa" w:w="60"/>
-              <w:left w:type="dxa" w:w="100"/>
-              <w:bottom w:type="dxa" w:w="60"/>
-              <w:right w:type="dxa" w:w="100"/>
-            </w:tcMar>
-          </w:tcPr>
-          <w:p>
-            <w:r>
-              <w:rPr>
-                <w:b w:val="false"/>
-                <w:bCs w:val="false"/>
-                <w:sz w:val="19"/>
-                <w:szCs w:val="19"/>
-              </w:rPr>
-              <w:t xml:space="preserve">Deploying these agents makes the organisation the deployer; run the (included) eu-ai-act agent's assessment before production and record it in the AIMS</w:t>
-            </w:r>
-          </w:p>
-        </w:tc>
-      </w:tr>
-      <w:tr>
-        <w:tc>
-          <w:tcPr>
-            <w:tcW w:type="dxa" w:w="3400"/>
-            <w:tcMar>
-              <w:top w:type="dxa" w:w="60"/>
-              <w:left w:type="dxa" w:w="100"/>
-              <w:bottom w:type="dxa" w:w="60"/>
-              <w:right w:type="dxa" w:w="100"/>
-            </w:tcMar>
-          </w:tcPr>
-          <w:p>
-            <w:r>
-              <w:rPr>
-                <w:b w:val="false"/>
-                <w:bCs w:val="false"/>
-                <w:sz w:val="19"/>
-                <w:szCs w:val="19"/>
-              </w:rPr>
-              <w:t xml:space="preserve">ISO/IEC 42001 (AIMS)</w:t>
-            </w:r>
-          </w:p>
-        </w:tc>
-        <w:tc>
-          <w:tcPr>
-            <w:tcW w:type="dxa" w:w="5960"/>
-            <w:tcMar>
-              <w:top w:type="dxa" w:w="60"/>
-              <w:left w:type="dxa" w:w="100"/>
-              <w:bottom w:type="dxa" w:w="60"/>
-              <w:right w:type="dxa" w:w="100"/>
-            </w:tcMar>
-          </w:tcPr>
-          <w:p>
-            <w:r>
-              <w:rPr>
-                <w:b w:val="false"/>
-                <w:bCs w:val="false"/>
-                <w:sz w:val="19"/>
-                <w:szCs w:val="19"/>
-              </w:rPr>
-              <w:t xml:space="preserve">This platform enters the AIMS scope; the approval policy, verifier rules and observability are the documented Annex A controls (A.6, A.9)</w:t>
-            </w:r>
-          </w:p>
-        </w:tc>
-      </w:tr>
-      <w:tr>
-        <w:tc>
-          <w:tcPr>
-            <w:tcW w:type="dxa" w:w="3400"/>
-            <w:tcMar>
-              <w:top w:type="dxa" w:w="60"/>
-              <w:left w:type="dxa" w:w="100"/>
-              <w:bottom w:type="dxa" w:w="60"/>
-              <w:right w:type="dxa" w:w="100"/>
-            </w:tcMar>
-          </w:tcPr>
-          <w:p>
-            <w:r>
-              <w:rPr>
-                <w:b w:val="false"/>
-                <w:bCs w:val="false"/>
-                <w:sz w:val="19"/>
-                <w:szCs w:val="19"/>
-              </w:rPr>
-              <w:t xml:space="preserve">GDPR minimisation</w:t>
-            </w:r>
-          </w:p>
-        </w:tc>
-        <w:tc>
-          <w:tcPr>
-            <w:tcW w:type="dxa" w:w="5960"/>
-            <w:tcMar>
-              <w:top w:type="dxa" w:w="60"/>
-              <w:left w:type="dxa" w:w="100"/>
-              <w:bottom w:type="dxa" w:w="60"/>
-              <w:right w:type="dxa" w:w="100"/>
-            </w:tcMar>
-          </w:tcPr>
-          <w:p>
-            <w:r>
-              <w:rPr>
-                <w:b w:val="false"/>
-                <w:bCs w:val="false"/>
-                <w:sz w:val="19"/>
-                <w:szCs w:val="19"/>
-              </w:rPr>
-              <w:t xml:space="preserve">Durable memory holds timestamped, individually deletable notes; verifier rule 5 blocks excess personal data in deliverables; memory store in RoPA/retention schedule</w:t>
-            </w:r>
-          </w:p>
-        </w:tc>
-      </w:tr>
-      <w:tr>
-        <w:tc>
-          <w:tcPr>
-            <w:tcW w:type="dxa" w:w="3400"/>
-            <w:tcMar>
-              <w:top w:type="dxa" w:w="60"/>
-              <w:left w:type="dxa" w:w="100"/>
-              <w:bottom w:type="dxa" w:w="60"/>
-              <w:right w:type="dxa" w:w="100"/>
-            </w:tcMar>
-          </w:tcPr>
-          <w:p>
-            <w:r>
-              <w:rPr>
-                <w:b w:val="false"/>
-                <w:bCs w:val="false"/>
-                <w:sz w:val="19"/>
-                <w:szCs w:val="19"/>
-              </w:rPr>
-              <w:t xml:space="preserve">Model substitution risk</w:t>
-            </w:r>
-          </w:p>
-        </w:tc>
-        <w:tc>
-          <w:tcPr>
-            <w:tcW w:type="dxa" w:w="5960"/>
-            <w:tcMar>
-              <w:top w:type="dxa" w:w="60"/>
-              <w:left w:type="dxa" w:w="100"/>
-              <w:bottom w:type="dxa" w:w="60"/>
-              <w:right w:type="dxa" w:w="100"/>
-            </w:tcMar>
-          </w:tcPr>
-          <w:p>
-            <w:r>
-              <w:rPr>
-                <w:b w:val="false"/>
-                <w:bCs w:val="false"/>
-                <w:sz w:val="19"/>
-                <w:szCs w:val="19"/>
-              </w:rPr>
-              <w:t xml:space="preserve">Claude models are not available on Azure; agents run on gpt-4o/o3-mini. UAT against claude.ai baselines is the acceptance control (Phase 4); report agents carry self-check + verifier as compensating controls</w:t>
-            </w:r>
-          </w:p>
-        </w:tc>
-      </w:tr>
-    </w:tbl>
-    <w:p>
-      <w:r>
-        <w:br w:type="page"/>
-      </w:r>
-    </w:p>
-    <w:p>
-      <w:pPr>
-        <w:pStyle w:val="Heading1"/>
-        <w:spacing w:after="160" w:before="360"/>
-      </w:pPr>
-      <w:r>
-        <w:t xml:space="preserve">12. Implementation Plan</w:t>
+        <w:t xml:space="preserve">Integrations are declared once in integrations/registry.json and attached per agent. Reads are broad within least-privilege scopes; writes are stripped from every agent tool and exist only inside the approval-gated workflows. Credentials live in Foundry connections backed by Key Vault; Graph integrations use dedicated Entra app registrations with admin-consented application permissions.</w:t>
       </w:r>
     </w:p>
     <w:p>
@@ -5586,7 +4386,7 @@
       <w:r>
         <w:drawing>
           <wp:inline distT="0" distB="0" distL="0" distR="0">
-            <wp:extent cx="5905500" cy="2800350"/>
+            <wp:extent cx="5905500" cy="4181475"/>
             <wp:effectExtent t="0" r="0" b="0" l="0"/>
             <wp:docPr id="1" name="" descr="" title=""/>
             <wp:cNvGraphicFramePr>
@@ -5611,7 +4411,1343 @@
                   <pic:spPr bwMode="auto">
                     <a:xfrm>
                       <a:off x="0" y="0"/>
-                      <a:ext cx="5905500" cy="2800350"/>
+                      <a:ext cx="5905500" cy="4181475"/>
+                    </a:xfrm>
+                    <a:prstGeom prst="rect">
+                      <a:avLst/>
+                    </a:prstGeom>
+                  </pic:spPr>
+                </pic:pic>
+              </a:graphicData>
+            </a:graphic>
+          </wp:inline>
+        </w:drawing>
+      </w:r>
+    </w:p>
+    <w:p>
+      <w:pPr>
+        <w:spacing w:after="240"/>
+        <w:jc w:val="center"/>
+      </w:pPr>
+      <w:r>
+        <w:rPr>
+          <w:i/>
+          <w:iCs/>
+          <w:color w:val="5B6B69"/>
+          <w:sz w:val="18"/>
+          <w:szCs w:val="18"/>
+        </w:rPr>
+        <w:t xml:space="preserve">Figure 4 — Interconnection map across the Euronext technology stack</w:t>
+      </w:r>
+    </w:p>
+    <w:tbl>
+      <w:tblPr>
+        <w:tblW w:type="dxa" w:w="9360"/>
+        <w:tblBorders>
+          <w:top w:val="single" w:color="auto" w:sz="4"/>
+          <w:left w:val="single" w:color="auto" w:sz="4"/>
+          <w:bottom w:val="single" w:color="auto" w:sz="4"/>
+          <w:right w:val="single" w:color="auto" w:sz="4"/>
+          <w:insideH w:val="single" w:color="auto" w:sz="4"/>
+          <w:insideV w:val="single" w:color="auto" w:sz="4"/>
+        </w:tblBorders>
+      </w:tblPr>
+      <w:tblGrid>
+        <w:gridCol w:w="2300"/>
+        <w:gridCol w:w="2800"/>
+        <w:gridCol w:w="4260"/>
+      </w:tblGrid>
+      <w:tr>
+        <w:trPr>
+          <w:tblHeader/>
+        </w:trPr>
+        <w:tc>
+          <w:tcPr>
+            <w:tcW w:type="dxa" w:w="2300"/>
+            <w:shd w:fill="008D7F" w:val="clear"/>
+            <w:tcMar>
+              <w:top w:type="dxa" w:w="60"/>
+              <w:left w:type="dxa" w:w="100"/>
+              <w:bottom w:type="dxa" w:w="60"/>
+              <w:right w:type="dxa" w:w="100"/>
+            </w:tcMar>
+          </w:tcPr>
+          <w:p>
+            <w:r>
+              <w:rPr>
+                <w:b/>
+                <w:bCs/>
+                <w:color w:val="FFFFFF"/>
+                <w:sz w:val="19"/>
+                <w:szCs w:val="19"/>
+              </w:rPr>
+              <w:t xml:space="preserve">System</w:t>
+            </w:r>
+          </w:p>
+        </w:tc>
+        <w:tc>
+          <w:tcPr>
+            <w:tcW w:type="dxa" w:w="2800"/>
+            <w:shd w:fill="008D7F" w:val="clear"/>
+            <w:tcMar>
+              <w:top w:type="dxa" w:w="60"/>
+              <w:left w:type="dxa" w:w="100"/>
+              <w:bottom w:type="dxa" w:w="60"/>
+              <w:right w:type="dxa" w:w="100"/>
+            </w:tcMar>
+          </w:tcPr>
+          <w:p>
+            <w:r>
+              <w:rPr>
+                <w:b/>
+                <w:bCs/>
+                <w:color w:val="FFFFFF"/>
+                <w:sz w:val="19"/>
+                <w:szCs w:val="19"/>
+              </w:rPr>
+              <w:t xml:space="preserve">Used by</w:t>
+            </w:r>
+          </w:p>
+        </w:tc>
+        <w:tc>
+          <w:tcPr>
+            <w:tcW w:type="dxa" w:w="4260"/>
+            <w:shd w:fill="008D7F" w:val="clear"/>
+            <w:tcMar>
+              <w:top w:type="dxa" w:w="60"/>
+              <w:left w:type="dxa" w:w="100"/>
+              <w:bottom w:type="dxa" w:w="60"/>
+              <w:right w:type="dxa" w:w="100"/>
+            </w:tcMar>
+          </w:tcPr>
+          <w:p>
+            <w:r>
+              <w:rPr>
+                <w:b/>
+                <w:bCs/>
+                <w:color w:val="FFFFFF"/>
+                <w:sz w:val="19"/>
+                <w:szCs w:val="19"/>
+              </w:rPr>
+              <w:t xml:space="preserve">Purpose</w:t>
+            </w:r>
+          </w:p>
+        </w:tc>
+      </w:tr>
+      <w:tr>
+        <w:tc>
+          <w:tcPr>
+            <w:tcW w:type="dxa" w:w="2300"/>
+            <w:tcMar>
+              <w:top w:type="dxa" w:w="60"/>
+              <w:left w:type="dxa" w:w="100"/>
+              <w:bottom w:type="dxa" w:w="60"/>
+              <w:right w:type="dxa" w:w="100"/>
+            </w:tcMar>
+          </w:tcPr>
+          <w:p>
+            <w:r>
+              <w:rPr>
+                <w:b w:val="false"/>
+                <w:bCs w:val="false"/>
+                <w:sz w:val="19"/>
+                <w:szCs w:val="19"/>
+              </w:rPr>
+              <w:t xml:space="preserve">Jira Cloud</w:t>
+            </w:r>
+          </w:p>
+        </w:tc>
+        <w:tc>
+          <w:tcPr>
+            <w:tcW w:type="dxa" w:w="2800"/>
+            <w:tcMar>
+              <w:top w:type="dxa" w:w="60"/>
+              <w:left w:type="dxa" w:w="100"/>
+              <w:bottom w:type="dxa" w:w="60"/>
+              <w:right w:type="dxa" w:w="100"/>
+            </w:tcMar>
+          </w:tcPr>
+          <w:p>
+            <w:r>
+              <w:rPr>
+                <w:b w:val="false"/>
+                <w:bCs w:val="false"/>
+                <w:sz w:val="19"/>
+                <w:szCs w:val="19"/>
+              </w:rPr>
+              <w:t xml:space="preserve">cyber-forum, ciso-reporting</w:t>
+            </w:r>
+          </w:p>
+        </w:tc>
+        <w:tc>
+          <w:tcPr>
+            <w:tcW w:type="dxa" w:w="4260"/>
+            <w:tcMar>
+              <w:top w:type="dxa" w:w="60"/>
+              <w:left w:type="dxa" w:w="100"/>
+              <w:bottom w:type="dxa" w:w="60"/>
+              <w:right w:type="dxa" w:w="100"/>
+            </w:tcMar>
+          </w:tcPr>
+          <w:p>
+            <w:r>
+              <w:rPr>
+                <w:b w:val="false"/>
+                <w:bCs w:val="false"/>
+                <w:sz w:val="19"/>
+                <w:szCs w:val="19"/>
+              </w:rPr>
+              <w:t xml:space="preserve">Remediation and finding tickets; JQL queries</w:t>
+            </w:r>
+          </w:p>
+        </w:tc>
+      </w:tr>
+      <w:tr>
+        <w:tc>
+          <w:tcPr>
+            <w:tcW w:type="dxa" w:w="2300"/>
+            <w:shd w:fill="E4F3F1" w:val="clear"/>
+            <w:tcMar>
+              <w:top w:type="dxa" w:w="60"/>
+              <w:left w:type="dxa" w:w="100"/>
+              <w:bottom w:type="dxa" w:w="60"/>
+              <w:right w:type="dxa" w:w="100"/>
+            </w:tcMar>
+          </w:tcPr>
+          <w:p>
+            <w:r>
+              <w:rPr>
+                <w:b w:val="false"/>
+                <w:bCs w:val="false"/>
+                <w:sz w:val="19"/>
+                <w:szCs w:val="19"/>
+              </w:rPr>
+              <w:t xml:space="preserve">Jira Assets (CMDB)</w:t>
+            </w:r>
+          </w:p>
+        </w:tc>
+        <w:tc>
+          <w:tcPr>
+            <w:tcW w:type="dxa" w:w="2800"/>
+            <w:shd w:fill="E4F3F1" w:val="clear"/>
+            <w:tcMar>
+              <w:top w:type="dxa" w:w="60"/>
+              <w:left w:type="dxa" w:w="100"/>
+              <w:bottom w:type="dxa" w:w="60"/>
+              <w:right w:type="dxa" w:w="100"/>
+            </w:tcMar>
+          </w:tcPr>
+          <w:p>
+            <w:r>
+              <w:rPr>
+                <w:b w:val="false"/>
+                <w:bCs w:val="false"/>
+                <w:sz w:val="19"/>
+                <w:szCs w:val="19"/>
+              </w:rPr>
+              <w:t xml:space="preserve">dora, tpsrca-engine</w:t>
+            </w:r>
+          </w:p>
+        </w:tc>
+        <w:tc>
+          <w:tcPr>
+            <w:tcW w:type="dxa" w:w="4260"/>
+            <w:shd w:fill="E4F3F1" w:val="clear"/>
+            <w:tcMar>
+              <w:top w:type="dxa" w:w="60"/>
+              <w:left w:type="dxa" w:w="100"/>
+              <w:bottom w:type="dxa" w:w="60"/>
+              <w:right w:type="dxa" w:w="100"/>
+            </w:tcMar>
+          </w:tcPr>
+          <w:p>
+            <w:r>
+              <w:rPr>
+                <w:b w:val="false"/>
+                <w:bCs w:val="false"/>
+                <w:sz w:val="19"/>
+                <w:szCs w:val="19"/>
+              </w:rPr>
+              <w:t xml:space="preserve">CI/supplier/service records for the DORA Register of Information and concentration risk</w:t>
+            </w:r>
+          </w:p>
+        </w:tc>
+      </w:tr>
+      <w:tr>
+        <w:tc>
+          <w:tcPr>
+            <w:tcW w:type="dxa" w:w="2300"/>
+            <w:tcMar>
+              <w:top w:type="dxa" w:w="60"/>
+              <w:left w:type="dxa" w:w="100"/>
+              <w:bottom w:type="dxa" w:w="60"/>
+              <w:right w:type="dxa" w:w="100"/>
+            </w:tcMar>
+          </w:tcPr>
+          <w:p>
+            <w:r>
+              <w:rPr>
+                <w:b w:val="false"/>
+                <w:bCs w:val="false"/>
+                <w:sz w:val="19"/>
+                <w:szCs w:val="19"/>
+              </w:rPr>
+              <w:t xml:space="preserve">OneTrust</w:t>
+            </w:r>
+          </w:p>
+        </w:tc>
+        <w:tc>
+          <w:tcPr>
+            <w:tcW w:type="dxa" w:w="2800"/>
+            <w:tcMar>
+              <w:top w:type="dxa" w:w="60"/>
+              <w:left w:type="dxa" w:w="100"/>
+              <w:bottom w:type="dxa" w:w="60"/>
+              <w:right w:type="dxa" w:w="100"/>
+            </w:tcMar>
+          </w:tcPr>
+          <w:p>
+            <w:r>
+              <w:rPr>
+                <w:b w:val="false"/>
+                <w:bCs w:val="false"/>
+                <w:sz w:val="19"/>
+                <w:szCs w:val="19"/>
+              </w:rPr>
+              <w:t xml:space="preserve">dpia, form-b, ciso-reporting/summary</w:t>
+            </w:r>
+          </w:p>
+        </w:tc>
+        <w:tc>
+          <w:tcPr>
+            <w:tcW w:type="dxa" w:w="4260"/>
+            <w:tcMar>
+              <w:top w:type="dxa" w:w="60"/>
+              <w:left w:type="dxa" w:w="100"/>
+              <w:bottom w:type="dxa" w:w="60"/>
+              <w:right w:type="dxa" w:w="100"/>
+            </w:tcMar>
+          </w:tcPr>
+          <w:p>
+            <w:r>
+              <w:rPr>
+                <w:b w:val="false"/>
+                <w:bCs w:val="false"/>
+                <w:sz w:val="19"/>
+                <w:szCs w:val="19"/>
+              </w:rPr>
+              <w:t xml:space="preserve">Assessment and vendor-inventory retrieval, replacing manual PDF hand-off</w:t>
+            </w:r>
+          </w:p>
+        </w:tc>
+      </w:tr>
+      <w:tr>
+        <w:tc>
+          <w:tcPr>
+            <w:tcW w:type="dxa" w:w="2300"/>
+            <w:shd w:fill="E4F3F1" w:val="clear"/>
+            <w:tcMar>
+              <w:top w:type="dxa" w:w="60"/>
+              <w:left w:type="dxa" w:w="100"/>
+              <w:bottom w:type="dxa" w:w="60"/>
+              <w:right w:type="dxa" w:w="100"/>
+            </w:tcMar>
+          </w:tcPr>
+          <w:p>
+            <w:r>
+              <w:rPr>
+                <w:b w:val="false"/>
+                <w:bCs w:val="false"/>
+                <w:sz w:val="19"/>
+                <w:szCs w:val="19"/>
+              </w:rPr>
+              <w:t xml:space="preserve">SecurityScorecard</w:t>
+            </w:r>
+          </w:p>
+        </w:tc>
+        <w:tc>
+          <w:tcPr>
+            <w:tcW w:type="dxa" w:w="2800"/>
+            <w:shd w:fill="E4F3F1" w:val="clear"/>
+            <w:tcMar>
+              <w:top w:type="dxa" w:w="60"/>
+              <w:left w:type="dxa" w:w="100"/>
+              <w:bottom w:type="dxa" w:w="60"/>
+              <w:right w:type="dxa" w:w="100"/>
+            </w:tcMar>
+          </w:tcPr>
+          <w:p>
+            <w:r>
+              <w:rPr>
+                <w:b w:val="false"/>
+                <w:bCs w:val="false"/>
+                <w:sz w:val="19"/>
+                <w:szCs w:val="19"/>
+              </w:rPr>
+              <w:t xml:space="preserve">deepsearch agents, tpsrca</w:t>
+            </w:r>
+          </w:p>
+        </w:tc>
+        <w:tc>
+          <w:tcPr>
+            <w:tcW w:type="dxa" w:w="4260"/>
+            <w:shd w:fill="E4F3F1" w:val="clear"/>
+            <w:tcMar>
+              <w:top w:type="dxa" w:w="60"/>
+              <w:left w:type="dxa" w:w="100"/>
+              <w:bottom w:type="dxa" w:w="60"/>
+              <w:right w:type="dxa" w:w="100"/>
+            </w:tcMar>
+          </w:tcPr>
+          <w:p>
+            <w:r>
+              <w:rPr>
+                <w:b w:val="false"/>
+                <w:bCs w:val="false"/>
+                <w:sz w:val="19"/>
+                <w:szCs w:val="19"/>
+              </w:rPr>
+              <w:t xml:space="preserve">External security-rating evidence</w:t>
+            </w:r>
+          </w:p>
+        </w:tc>
+      </w:tr>
+      <w:tr>
+        <w:tc>
+          <w:tcPr>
+            <w:tcW w:type="dxa" w:w="2300"/>
+            <w:tcMar>
+              <w:top w:type="dxa" w:w="60"/>
+              <w:left w:type="dxa" w:w="100"/>
+              <w:bottom w:type="dxa" w:w="60"/>
+              <w:right w:type="dxa" w:w="100"/>
+            </w:tcMar>
+          </w:tcPr>
+          <w:p>
+            <w:r>
+              <w:rPr>
+                <w:b w:val="false"/>
+                <w:bCs w:val="false"/>
+                <w:sz w:val="19"/>
+                <w:szCs w:val="19"/>
+              </w:rPr>
+              <w:t xml:space="preserve">Microsoft Defender (Graph)</w:t>
+            </w:r>
+          </w:p>
+        </w:tc>
+        <w:tc>
+          <w:tcPr>
+            <w:tcW w:type="dxa" w:w="2800"/>
+            <w:tcMar>
+              <w:top w:type="dxa" w:w="60"/>
+              <w:left w:type="dxa" w:w="100"/>
+              <w:bottom w:type="dxa" w:w="60"/>
+              <w:right w:type="dxa" w:w="100"/>
+            </w:tcMar>
+          </w:tcPr>
+          <w:p>
+            <w:r>
+              <w:rPr>
+                <w:b w:val="false"/>
+                <w:bCs w:val="false"/>
+                <w:sz w:val="19"/>
+                <w:szCs w:val="19"/>
+              </w:rPr>
+              <w:t xml:space="preserve">cyber-forum</w:t>
+            </w:r>
+          </w:p>
+        </w:tc>
+        <w:tc>
+          <w:tcPr>
+            <w:tcW w:type="dxa" w:w="4260"/>
+            <w:tcMar>
+              <w:top w:type="dxa" w:w="60"/>
+              <w:left w:type="dxa" w:w="100"/>
+              <w:bottom w:type="dxa" w:w="60"/>
+              <w:right w:type="dxa" w:w="100"/>
+            </w:tcMar>
+          </w:tcPr>
+          <w:p>
+            <w:r>
+              <w:rPr>
+                <w:b w:val="false"/>
+                <w:bCs w:val="false"/>
+                <w:sz w:val="19"/>
+                <w:szCs w:val="19"/>
+              </w:rPr>
+              <w:t xml:space="preserve">Incidents, alerts, KQL hunting, Secure Score for threat briefs</w:t>
+            </w:r>
+          </w:p>
+        </w:tc>
+      </w:tr>
+      <w:tr>
+        <w:tc>
+          <w:tcPr>
+            <w:tcW w:type="dxa" w:w="2300"/>
+            <w:shd w:fill="E4F3F1" w:val="clear"/>
+            <w:tcMar>
+              <w:top w:type="dxa" w:w="60"/>
+              <w:left w:type="dxa" w:w="100"/>
+              <w:bottom w:type="dxa" w:w="60"/>
+              <w:right w:type="dxa" w:w="100"/>
+            </w:tcMar>
+          </w:tcPr>
+          <w:p>
+            <w:r>
+              <w:rPr>
+                <w:b w:val="false"/>
+                <w:bCs w:val="false"/>
+                <w:sz w:val="19"/>
+                <w:szCs w:val="19"/>
+              </w:rPr>
+              <w:t xml:space="preserve">SharePoint (Graph)</w:t>
+            </w:r>
+          </w:p>
+        </w:tc>
+        <w:tc>
+          <w:tcPr>
+            <w:tcW w:type="dxa" w:w="2800"/>
+            <w:shd w:fill="E4F3F1" w:val="clear"/>
+            <w:tcMar>
+              <w:top w:type="dxa" w:w="60"/>
+              <w:left w:type="dxa" w:w="100"/>
+              <w:bottom w:type="dxa" w:w="60"/>
+              <w:right w:type="dxa" w:w="100"/>
+            </w:tcMar>
+          </w:tcPr>
+          <w:p>
+            <w:r>
+              <w:rPr>
+                <w:b w:val="false"/>
+                <w:bCs w:val="false"/>
+                <w:sz w:val="19"/>
+                <w:szCs w:val="19"/>
+              </w:rPr>
+              <w:t xml:space="preserve">document and reporting agents</w:t>
+            </w:r>
+          </w:p>
+        </w:tc>
+        <w:tc>
+          <w:tcPr>
+            <w:tcW w:type="dxa" w:w="4260"/>
+            <w:shd w:fill="E4F3F1" w:val="clear"/>
+            <w:tcMar>
+              <w:top w:type="dxa" w:w="60"/>
+              <w:left w:type="dxa" w:w="100"/>
+              <w:bottom w:type="dxa" w:w="60"/>
+              <w:right w:type="dxa" w:w="100"/>
+            </w:tcMar>
+          </w:tcPr>
+          <w:p>
+            <w:r>
+              <w:rPr>
+                <w:b w:val="false"/>
+                <w:bCs w:val="false"/>
+                <w:sz w:val="19"/>
+                <w:szCs w:val="19"/>
+              </w:rPr>
+              <w:t xml:space="preserve">Evidence repository reads; publishing generated deliverables</w:t>
+            </w:r>
+          </w:p>
+        </w:tc>
+      </w:tr>
+      <w:tr>
+        <w:tc>
+          <w:tcPr>
+            <w:tcW w:type="dxa" w:w="2300"/>
+            <w:tcMar>
+              <w:top w:type="dxa" w:w="60"/>
+              <w:left w:type="dxa" w:w="100"/>
+              <w:bottom w:type="dxa" w:w="60"/>
+              <w:right w:type="dxa" w:w="100"/>
+            </w:tcMar>
+          </w:tcPr>
+          <w:p>
+            <w:r>
+              <w:rPr>
+                <w:b w:val="false"/>
+                <w:bCs w:val="false"/>
+                <w:sz w:val="19"/>
+                <w:szCs w:val="19"/>
+              </w:rPr>
+              <w:t xml:space="preserve">IAF API (template)</w:t>
+            </w:r>
+          </w:p>
+        </w:tc>
+        <w:tc>
+          <w:tcPr>
+            <w:tcW w:type="dxa" w:w="2800"/>
+            <w:tcMar>
+              <w:top w:type="dxa" w:w="60"/>
+              <w:left w:type="dxa" w:w="100"/>
+              <w:bottom w:type="dxa" w:w="60"/>
+              <w:right w:type="dxa" w:w="100"/>
+            </w:tcMar>
+          </w:tcPr>
+          <w:p>
+            <w:r>
+              <w:rPr>
+                <w:b w:val="false"/>
+                <w:bCs w:val="false"/>
+                <w:sz w:val="19"/>
+                <w:szCs w:val="19"/>
+              </w:rPr>
+              <w:t xml:space="preserve">dpia, dora, deepsearch, tpsrca</w:t>
+            </w:r>
+          </w:p>
+        </w:tc>
+        <w:tc>
+          <w:tcPr>
+            <w:tcW w:type="dxa" w:w="4260"/>
+            <w:tcMar>
+              <w:top w:type="dxa" w:w="60"/>
+              <w:left w:type="dxa" w:w="100"/>
+              <w:bottom w:type="dxa" w:w="60"/>
+              <w:right w:type="dxa" w:w="100"/>
+            </w:tcMar>
+          </w:tcPr>
+          <w:p>
+            <w:r>
+              <w:rPr>
+                <w:b w:val="false"/>
+                <w:bCs w:val="false"/>
+                <w:sz w:val="19"/>
+                <w:szCs w:val="19"/>
+              </w:rPr>
+              <w:t xml:space="preserve">Internal assurance framework; align template to the internal spec before use</w:t>
+            </w:r>
+          </w:p>
+        </w:tc>
+      </w:tr>
+      <w:tr>
+        <w:tc>
+          <w:tcPr>
+            <w:tcW w:type="dxa" w:w="2300"/>
+            <w:shd w:fill="E4F3F1" w:val="clear"/>
+            <w:tcMar>
+              <w:top w:type="dxa" w:w="60"/>
+              <w:left w:type="dxa" w:w="100"/>
+              <w:bottom w:type="dxa" w:w="60"/>
+              <w:right w:type="dxa" w:w="100"/>
+            </w:tcMar>
+          </w:tcPr>
+          <w:p>
+            <w:r>
+              <w:rPr>
+                <w:b w:val="false"/>
+                <w:bCs w:val="false"/>
+                <w:sz w:val="19"/>
+                <w:szCs w:val="19"/>
+              </w:rPr>
+              <w:t xml:space="preserve">ENX Gateway MCP (template)</w:t>
+            </w:r>
+          </w:p>
+        </w:tc>
+        <w:tc>
+          <w:tcPr>
+            <w:tcW w:type="dxa" w:w="2800"/>
+            <w:shd w:fill="E4F3F1" w:val="clear"/>
+            <w:tcMar>
+              <w:top w:type="dxa" w:w="60"/>
+              <w:left w:type="dxa" w:w="100"/>
+              <w:bottom w:type="dxa" w:w="60"/>
+              <w:right w:type="dxa" w:w="100"/>
+            </w:tcMar>
+          </w:tcPr>
+          <w:p>
+            <w:r>
+              <w:rPr>
+                <w:b w:val="false"/>
+                <w:bCs w:val="false"/>
+                <w:sz w:val="19"/>
+                <w:szCs w:val="19"/>
+              </w:rPr>
+              <w:t xml:space="preserve">control-center, deepsearch, cyber-forum</w:t>
+            </w:r>
+          </w:p>
+        </w:tc>
+        <w:tc>
+          <w:tcPr>
+            <w:tcW w:type="dxa" w:w="4260"/>
+            <w:shd w:fill="E4F3F1" w:val="clear"/>
+            <w:tcMar>
+              <w:top w:type="dxa" w:w="60"/>
+              <w:left w:type="dxa" w:w="100"/>
+              <w:bottom w:type="dxa" w:w="60"/>
+              <w:right w:type="dxa" w:w="100"/>
+            </w:tcMar>
+          </w:tcPr>
+          <w:p>
+            <w:r>
+              <w:rPr>
+                <w:b w:val="false"/>
+                <w:bCs w:val="false"/>
+                <w:sz w:val="19"/>
+                <w:szCs w:val="19"/>
+              </w:rPr>
+              <w:t xml:space="preserve">Internal gateway tools; fill server URL and allowlist from the gateway listing</w:t>
+            </w:r>
+          </w:p>
+        </w:tc>
+      </w:tr>
+      <w:tr>
+        <w:tc>
+          <w:tcPr>
+            <w:tcW w:type="dxa" w:w="2300"/>
+            <w:tcMar>
+              <w:top w:type="dxa" w:w="60"/>
+              <w:left w:type="dxa" w:w="100"/>
+              <w:bottom w:type="dxa" w:w="60"/>
+              <w:right w:type="dxa" w:w="100"/>
+            </w:tcMar>
+          </w:tcPr>
+          <w:p>
+            <w:r>
+              <w:rPr>
+                <w:b w:val="false"/>
+                <w:bCs w:val="false"/>
+                <w:sz w:val="19"/>
+                <w:szCs w:val="19"/>
+              </w:rPr>
+              <w:t xml:space="preserve">Bing web search</w:t>
+            </w:r>
+          </w:p>
+        </w:tc>
+        <w:tc>
+          <w:tcPr>
+            <w:tcW w:type="dxa" w:w="2800"/>
+            <w:tcMar>
+              <w:top w:type="dxa" w:w="60"/>
+              <w:left w:type="dxa" w:w="100"/>
+              <w:bottom w:type="dxa" w:w="60"/>
+              <w:right w:type="dxa" w:w="100"/>
+            </w:tcMar>
+          </w:tcPr>
+          <w:p>
+            <w:r>
+              <w:rPr>
+                <w:b w:val="false"/>
+                <w:bCs w:val="false"/>
+                <w:sz w:val="19"/>
+                <w:szCs w:val="19"/>
+              </w:rPr>
+              <w:t xml:space="preserve">research and regulatory agents</w:t>
+            </w:r>
+          </w:p>
+        </w:tc>
+        <w:tc>
+          <w:tcPr>
+            <w:tcW w:type="dxa" w:w="4260"/>
+            <w:tcMar>
+              <w:top w:type="dxa" w:w="60"/>
+              <w:left w:type="dxa" w:w="100"/>
+              <w:bottom w:type="dxa" w:w="60"/>
+              <w:right w:type="dxa" w:w="100"/>
+            </w:tcMar>
+          </w:tcPr>
+          <w:p>
+            <w:r>
+              <w:rPr>
+                <w:b w:val="false"/>
+                <w:bCs w:val="false"/>
+                <w:sz w:val="19"/>
+                <w:szCs w:val="19"/>
+              </w:rPr>
+              <w:t xml:space="preserve">Grounded, cited web research</w:t>
+            </w:r>
+          </w:p>
+        </w:tc>
+      </w:tr>
+      <w:tr>
+        <w:tc>
+          <w:tcPr>
+            <w:tcW w:type="dxa" w:w="2300"/>
+            <w:shd w:fill="E4F3F1" w:val="clear"/>
+            <w:tcMar>
+              <w:top w:type="dxa" w:w="60"/>
+              <w:left w:type="dxa" w:w="100"/>
+              <w:bottom w:type="dxa" w:w="60"/>
+              <w:right w:type="dxa" w:w="100"/>
+            </w:tcMar>
+          </w:tcPr>
+          <w:p>
+            <w:r>
+              <w:rPr>
+                <w:b w:val="false"/>
+                <w:bCs w:val="false"/>
+                <w:sz w:val="19"/>
+                <w:szCs w:val="19"/>
+              </w:rPr>
+              <w:t xml:space="preserve">Microsoft 365 Copilot</w:t>
+            </w:r>
+          </w:p>
+        </w:tc>
+        <w:tc>
+          <w:tcPr>
+            <w:tcW w:type="dxa" w:w="2800"/>
+            <w:shd w:fill="E4F3F1" w:val="clear"/>
+            <w:tcMar>
+              <w:top w:type="dxa" w:w="60"/>
+              <w:left w:type="dxa" w:w="100"/>
+              <w:bottom w:type="dxa" w:w="60"/>
+              <w:right w:type="dxa" w:w="100"/>
+            </w:tcMar>
+          </w:tcPr>
+          <w:p>
+            <w:r>
+              <w:rPr>
+                <w:b w:val="false"/>
+                <w:bCs w:val="false"/>
+                <w:sz w:val="19"/>
+                <w:szCs w:val="19"/>
+              </w:rPr>
+              <w:t xml:space="preserve">Q&amp;A agents</w:t>
+            </w:r>
+          </w:p>
+        </w:tc>
+        <w:tc>
+          <w:tcPr>
+            <w:tcW w:type="dxa" w:w="4260"/>
+            <w:shd w:fill="E4F3F1" w:val="clear"/>
+            <w:tcMar>
+              <w:top w:type="dxa" w:w="60"/>
+              <w:left w:type="dxa" w:w="100"/>
+              <w:bottom w:type="dxa" w:w="60"/>
+              <w:right w:type="dxa" w:w="100"/>
+            </w:tcMar>
+          </w:tcPr>
+          <w:p>
+            <w:r>
+              <w:rPr>
+                <w:b w:val="false"/>
+                <w:bCs w:val="false"/>
+                <w:sz w:val="19"/>
+                <w:szCs w:val="19"/>
+              </w:rPr>
+              <w:t xml:space="preserve">Team-member access from Teams/Copilot chat</w:t>
+            </w:r>
+          </w:p>
+        </w:tc>
+      </w:tr>
+    </w:tbl>
+    <w:p>
+      <w:pPr>
+        <w:pStyle w:val="Heading1"/>
+        <w:spacing w:after="160" w:before="360"/>
+      </w:pPr>
+      <w:r>
+        <w:t xml:space="preserve">11. Security and Governance</w:t>
+      </w:r>
+    </w:p>
+    <w:p>
+      <w:pPr>
+        <w:pStyle w:val="Heading2"/>
+        <w:spacing w:after="120" w:before="260"/>
+      </w:pPr>
+      <w:r>
+        <w:t xml:space="preserve">11.1 Human approval — three enforced layers</w:t>
+      </w:r>
+    </w:p>
+    <w:p>
+      <w:pPr>
+        <w:pStyle w:val="ListParagraph"/>
+        <w:numPr>
+          <w:ilvl w:val="0"/>
+          <w:numId w:val="2"/>
+        </w:numPr>
+        <w:spacing w:after="80"/>
+      </w:pPr>
+      <w:r>
+        <w:rPr>
+          <w:b/>
+          <w:bCs/>
+        </w:rPr>
+        <w:t xml:space="preserve">Layer 1 (technical): </w:t>
+      </w:r>
+      <w:r>
+        <w:t xml:space="preserve">agents hold read-only tools — non-GET operations are stripped before attachment; write grants default to zero and any grant is a reviewable repository diff.</w:t>
+      </w:r>
+    </w:p>
+    <w:p>
+      <w:pPr>
+        <w:pStyle w:val="ListParagraph"/>
+        <w:numPr>
+          <w:ilvl w:val="0"/>
+          <w:numId w:val="2"/>
+        </w:numPr>
+        <w:spacing w:after="80"/>
+      </w:pPr>
+      <w:r>
+        <w:rPr>
+          <w:b/>
+          <w:bCs/>
+        </w:rPr>
+        <w:t xml:space="preserve">Layer 2 (behavioural): </w:t>
+      </w:r>
+      <w:r>
+        <w:t xml:space="preserve">every agent's instructions end with an injection-resistant APPROVAL GATE: complete draft, explicit 'approved' in-conversation, edit requests restart the cycle; nothing in retrieved documents or tool output can waive it.</w:t>
+      </w:r>
+    </w:p>
+    <w:p>
+      <w:pPr>
+        <w:pStyle w:val="ListParagraph"/>
+        <w:numPr>
+          <w:ilvl w:val="0"/>
+          <w:numId w:val="2"/>
+        </w:numPr>
+        <w:spacing w:after="80"/>
+      </w:pPr>
+      <w:r>
+        <w:rPr>
+          <w:b/>
+          <w:bCs/>
+        </w:rPr>
+        <w:t xml:space="preserve">Layer 3 (procedural): </w:t>
+      </w:r>
+      <w:r>
+        <w:t xml:space="preserve">workflow submissions suspend on approval webhooks with 3-day expiry; rejections are recorded, never submitted.</w:t>
+      </w:r>
+    </w:p>
+    <w:p>
+      <w:pPr>
+        <w:pStyle w:val="Heading2"/>
+        <w:spacing w:after="120" w:before="260"/>
+      </w:pPr>
+      <w:r>
+        <w:t xml:space="preserve">11.2 Verification before approval</w:t>
+      </w:r>
+    </w:p>
+    <w:p>
+      <w:pPr>
+        <w:spacing w:after="140"/>
+        <w:jc w:val="both"/>
+      </w:pPr>
+      <w:r>
+        <w:t xml:space="preserve">The output-verifier checks each deliverable draft against deterministic rules — section completeness per deliverable type, score/threshold consistency (TPRM High ≥ 7.0 / Medium ≥ 4.0; slide colour bands red ≥ 5.5 / amber ≥ 4.0), citation presence for regulatory claims, no residual placeholders, data minimisation, and approval-gate integrity — returning a strict PASS/FAIL with findings. A FAIL returns the draft to the producing agent (at most twice) before escalation.</w:t>
+      </w:r>
+    </w:p>
+    <w:p>
+      <w:pPr>
+        <w:pStyle w:val="Heading2"/>
+        <w:spacing w:after="120" w:before="260"/>
+      </w:pPr>
+      <w:r>
+        <w:t xml:space="preserve">11.3 Platform security</w:t>
+      </w:r>
+    </w:p>
+    <w:p>
+      <w:pPr>
+        <w:pStyle w:val="ListParagraph"/>
+        <w:numPr>
+          <w:ilvl w:val="0"/>
+          <w:numId w:val="2"/>
+        </w:numPr>
+        <w:spacing w:after="80"/>
+      </w:pPr>
+      <w:r>
+        <w:t xml:space="preserve">Entra-only authentication (local auth disabled on the Foundry account); RBAC via the Azure AI User role; managed identities for workflows and hosted MCP.</w:t>
+      </w:r>
+    </w:p>
+    <w:p>
+      <w:pPr>
+        <w:pStyle w:val="ListParagraph"/>
+        <w:numPr>
+          <w:ilvl w:val="0"/>
+          <w:numId w:val="2"/>
+        </w:numPr>
+        <w:spacing w:after="80"/>
+      </w:pPr>
+      <w:r>
+        <w:t xml:space="preserve">Secrets exclusively in Key Vault-backed connections; the repository contains placeholders only (verified by secret scan).</w:t>
+      </w:r>
+    </w:p>
+    <w:p>
+      <w:pPr>
+        <w:pStyle w:val="ListParagraph"/>
+        <w:numPr>
+          <w:ilvl w:val="0"/>
+          <w:numId w:val="2"/>
+        </w:numPr>
+        <w:spacing w:after="80"/>
+      </w:pPr>
+      <w:r>
+        <w:t xml:space="preserve">Azure AI content filtering applies to both model deployments; App Insights traces every run for audit; Log Analytics retention aligned to the ISMS (90 days, adjustable).</w:t>
+      </w:r>
+    </w:p>
+    <w:p>
+      <w:pPr>
+        <w:pStyle w:val="ListParagraph"/>
+        <w:numPr>
+          <w:ilvl w:val="0"/>
+          <w:numId w:val="2"/>
+        </w:numPr>
+        <w:spacing w:after="80"/>
+      </w:pPr>
+      <w:r>
+        <w:t xml:space="preserve">Public network access is enabled for the pilot and should move to private endpoints for production (parameterised in the Bicep).</w:t>
+      </w:r>
+    </w:p>
+    <w:p>
+      <w:pPr>
+        <w:pStyle w:val="Heading2"/>
+        <w:spacing w:after="120" w:before="260"/>
+      </w:pPr>
+      <w:r>
+        <w:t xml:space="preserve">11.4 Compliance position</w:t>
+      </w:r>
+    </w:p>
+    <w:tbl>
+      <w:tblPr>
+        <w:tblW w:type="dxa" w:w="9360"/>
+        <w:tblBorders>
+          <w:top w:val="single" w:color="auto" w:sz="4"/>
+          <w:left w:val="single" w:color="auto" w:sz="4"/>
+          <w:bottom w:val="single" w:color="auto" w:sz="4"/>
+          <w:right w:val="single" w:color="auto" w:sz="4"/>
+          <w:insideH w:val="single" w:color="auto" w:sz="4"/>
+          <w:insideV w:val="single" w:color="auto" w:sz="4"/>
+        </w:tblBorders>
+      </w:tblPr>
+      <w:tblGrid>
+        <w:gridCol w:w="3400"/>
+        <w:gridCol w:w="5960"/>
+      </w:tblGrid>
+      <w:tr>
+        <w:trPr>
+          <w:tblHeader/>
+        </w:trPr>
+        <w:tc>
+          <w:tcPr>
+            <w:tcW w:type="dxa" w:w="3400"/>
+            <w:shd w:fill="008D7F" w:val="clear"/>
+            <w:tcMar>
+              <w:top w:type="dxa" w:w="60"/>
+              <w:left w:type="dxa" w:w="100"/>
+              <w:bottom w:type="dxa" w:w="60"/>
+              <w:right w:type="dxa" w:w="100"/>
+            </w:tcMar>
+          </w:tcPr>
+          <w:p>
+            <w:r>
+              <w:rPr>
+                <w:b/>
+                <w:bCs/>
+                <w:color w:val="FFFFFF"/>
+                <w:sz w:val="19"/>
+                <w:szCs w:val="19"/>
+              </w:rPr>
+              <w:t xml:space="preserve">Obligation</w:t>
+            </w:r>
+          </w:p>
+        </w:tc>
+        <w:tc>
+          <w:tcPr>
+            <w:tcW w:type="dxa" w:w="5960"/>
+            <w:shd w:fill="008D7F" w:val="clear"/>
+            <w:tcMar>
+              <w:top w:type="dxa" w:w="60"/>
+              <w:left w:type="dxa" w:w="100"/>
+              <w:bottom w:type="dxa" w:w="60"/>
+              <w:right w:type="dxa" w:w="100"/>
+            </w:tcMar>
+          </w:tcPr>
+          <w:p>
+            <w:r>
+              <w:rPr>
+                <w:b/>
+                <w:bCs/>
+                <w:color w:val="FFFFFF"/>
+                <w:sz w:val="19"/>
+                <w:szCs w:val="19"/>
+              </w:rPr>
+              <w:t xml:space="preserve">How it is met</w:t>
+            </w:r>
+          </w:p>
+        </w:tc>
+      </w:tr>
+      <w:tr>
+        <w:tc>
+          <w:tcPr>
+            <w:tcW w:type="dxa" w:w="3400"/>
+            <w:tcMar>
+              <w:top w:type="dxa" w:w="60"/>
+              <w:left w:type="dxa" w:w="100"/>
+              <w:bottom w:type="dxa" w:w="60"/>
+              <w:right w:type="dxa" w:w="100"/>
+            </w:tcMar>
+          </w:tcPr>
+          <w:p>
+            <w:r>
+              <w:rPr>
+                <w:b w:val="false"/>
+                <w:bCs w:val="false"/>
+                <w:sz w:val="19"/>
+                <w:szCs w:val="19"/>
+              </w:rPr>
+              <w:t xml:space="preserve">EU AI Act Art. 14 (human oversight)</w:t>
+            </w:r>
+          </w:p>
+        </w:tc>
+        <w:tc>
+          <w:tcPr>
+            <w:tcW w:type="dxa" w:w="5960"/>
+            <w:tcMar>
+              <w:top w:type="dxa" w:w="60"/>
+              <w:left w:type="dxa" w:w="100"/>
+              <w:bottom w:type="dxa" w:w="60"/>
+              <w:right w:type="dxa" w:w="100"/>
+            </w:tcMar>
+          </w:tcPr>
+          <w:p>
+            <w:r>
+              <w:rPr>
+                <w:b w:val="false"/>
+                <w:bCs w:val="false"/>
+                <w:sz w:val="19"/>
+                <w:szCs w:val="19"/>
+              </w:rPr>
+              <w:t xml:space="preserve">The three-layer approval control: outputs take effect only after natural-person review; workflow run history is the evidence</w:t>
+            </w:r>
+          </w:p>
+        </w:tc>
+      </w:tr>
+      <w:tr>
+        <w:tc>
+          <w:tcPr>
+            <w:tcW w:type="dxa" w:w="3400"/>
+            <w:shd w:fill="E4F3F1" w:val="clear"/>
+            <w:tcMar>
+              <w:top w:type="dxa" w:w="60"/>
+              <w:left w:type="dxa" w:w="100"/>
+              <w:bottom w:type="dxa" w:w="60"/>
+              <w:right w:type="dxa" w:w="100"/>
+            </w:tcMar>
+          </w:tcPr>
+          <w:p>
+            <w:r>
+              <w:rPr>
+                <w:b w:val="false"/>
+                <w:bCs w:val="false"/>
+                <w:sz w:val="19"/>
+                <w:szCs w:val="19"/>
+              </w:rPr>
+              <w:t xml:space="preserve">EU AI Act deployer duties</w:t>
+            </w:r>
+          </w:p>
+        </w:tc>
+        <w:tc>
+          <w:tcPr>
+            <w:tcW w:type="dxa" w:w="5960"/>
+            <w:shd w:fill="E4F3F1" w:val="clear"/>
+            <w:tcMar>
+              <w:top w:type="dxa" w:w="60"/>
+              <w:left w:type="dxa" w:w="100"/>
+              <w:bottom w:type="dxa" w:w="60"/>
+              <w:right w:type="dxa" w:w="100"/>
+            </w:tcMar>
+          </w:tcPr>
+          <w:p>
+            <w:r>
+              <w:rPr>
+                <w:b w:val="false"/>
+                <w:bCs w:val="false"/>
+                <w:sz w:val="19"/>
+                <w:szCs w:val="19"/>
+              </w:rPr>
+              <w:t xml:space="preserve">Deploying these agents makes the organisation the deployer; run the (included) eu-ai-act agent's assessment before production and record it in the AIMS</w:t>
+            </w:r>
+          </w:p>
+        </w:tc>
+      </w:tr>
+      <w:tr>
+        <w:tc>
+          <w:tcPr>
+            <w:tcW w:type="dxa" w:w="3400"/>
+            <w:tcMar>
+              <w:top w:type="dxa" w:w="60"/>
+              <w:left w:type="dxa" w:w="100"/>
+              <w:bottom w:type="dxa" w:w="60"/>
+              <w:right w:type="dxa" w:w="100"/>
+            </w:tcMar>
+          </w:tcPr>
+          <w:p>
+            <w:r>
+              <w:rPr>
+                <w:b w:val="false"/>
+                <w:bCs w:val="false"/>
+                <w:sz w:val="19"/>
+                <w:szCs w:val="19"/>
+              </w:rPr>
+              <w:t xml:space="preserve">ISO/IEC 42001 (AIMS)</w:t>
+            </w:r>
+          </w:p>
+        </w:tc>
+        <w:tc>
+          <w:tcPr>
+            <w:tcW w:type="dxa" w:w="5960"/>
+            <w:tcMar>
+              <w:top w:type="dxa" w:w="60"/>
+              <w:left w:type="dxa" w:w="100"/>
+              <w:bottom w:type="dxa" w:w="60"/>
+              <w:right w:type="dxa" w:w="100"/>
+            </w:tcMar>
+          </w:tcPr>
+          <w:p>
+            <w:r>
+              <w:rPr>
+                <w:b w:val="false"/>
+                <w:bCs w:val="false"/>
+                <w:sz w:val="19"/>
+                <w:szCs w:val="19"/>
+              </w:rPr>
+              <w:t xml:space="preserve">This platform enters the AIMS scope; the approval policy, verifier rules and observability are the documented Annex A controls (A.6, A.9)</w:t>
+            </w:r>
+          </w:p>
+        </w:tc>
+      </w:tr>
+      <w:tr>
+        <w:tc>
+          <w:tcPr>
+            <w:tcW w:type="dxa" w:w="3400"/>
+            <w:shd w:fill="E4F3F1" w:val="clear"/>
+            <w:tcMar>
+              <w:top w:type="dxa" w:w="60"/>
+              <w:left w:type="dxa" w:w="100"/>
+              <w:bottom w:type="dxa" w:w="60"/>
+              <w:right w:type="dxa" w:w="100"/>
+            </w:tcMar>
+          </w:tcPr>
+          <w:p>
+            <w:r>
+              <w:rPr>
+                <w:b w:val="false"/>
+                <w:bCs w:val="false"/>
+                <w:sz w:val="19"/>
+                <w:szCs w:val="19"/>
+              </w:rPr>
+              <w:t xml:space="preserve">GDPR minimisation</w:t>
+            </w:r>
+          </w:p>
+        </w:tc>
+        <w:tc>
+          <w:tcPr>
+            <w:tcW w:type="dxa" w:w="5960"/>
+            <w:shd w:fill="E4F3F1" w:val="clear"/>
+            <w:tcMar>
+              <w:top w:type="dxa" w:w="60"/>
+              <w:left w:type="dxa" w:w="100"/>
+              <w:bottom w:type="dxa" w:w="60"/>
+              <w:right w:type="dxa" w:w="100"/>
+            </w:tcMar>
+          </w:tcPr>
+          <w:p>
+            <w:r>
+              <w:rPr>
+                <w:b w:val="false"/>
+                <w:bCs w:val="false"/>
+                <w:sz w:val="19"/>
+                <w:szCs w:val="19"/>
+              </w:rPr>
+              <w:t xml:space="preserve">Durable memory holds timestamped, individually deletable notes; verifier rule 5 blocks excess personal data in deliverables; memory store in RoPA/retention schedule</w:t>
+            </w:r>
+          </w:p>
+        </w:tc>
+      </w:tr>
+      <w:tr>
+        <w:tc>
+          <w:tcPr>
+            <w:tcW w:type="dxa" w:w="3400"/>
+            <w:tcMar>
+              <w:top w:type="dxa" w:w="60"/>
+              <w:left w:type="dxa" w:w="100"/>
+              <w:bottom w:type="dxa" w:w="60"/>
+              <w:right w:type="dxa" w:w="100"/>
+            </w:tcMar>
+          </w:tcPr>
+          <w:p>
+            <w:r>
+              <w:rPr>
+                <w:b w:val="false"/>
+                <w:bCs w:val="false"/>
+                <w:sz w:val="19"/>
+                <w:szCs w:val="19"/>
+              </w:rPr>
+              <w:t xml:space="preserve">Model substitution risk</w:t>
+            </w:r>
+          </w:p>
+        </w:tc>
+        <w:tc>
+          <w:tcPr>
+            <w:tcW w:type="dxa" w:w="5960"/>
+            <w:tcMar>
+              <w:top w:type="dxa" w:w="60"/>
+              <w:left w:type="dxa" w:w="100"/>
+              <w:bottom w:type="dxa" w:w="60"/>
+              <w:right w:type="dxa" w:w="100"/>
+            </w:tcMar>
+          </w:tcPr>
+          <w:p>
+            <w:r>
+              <w:rPr>
+                <w:b w:val="false"/>
+                <w:bCs w:val="false"/>
+                <w:sz w:val="19"/>
+                <w:szCs w:val="19"/>
+              </w:rPr>
+              <w:t xml:space="preserve">Claude models are not available on Azure; agents run on gpt-4o/o3-mini. UAT against claude.ai baselines is the acceptance control (Phase 4); report agents carry self-check + verifier as compensating controls</w:t>
+            </w:r>
+          </w:p>
+        </w:tc>
+      </w:tr>
+    </w:tbl>
+    <w:p>
+      <w:r>
+        <w:br w:type="page"/>
+      </w:r>
+    </w:p>
+    <w:p>
+      <w:pPr>
+        <w:pStyle w:val="Heading1"/>
+        <w:spacing w:after="160" w:before="360"/>
+      </w:pPr>
+      <w:r>
+        <w:t xml:space="preserve">12. Implementation Plan</w:t>
+      </w:r>
+    </w:p>
+    <w:p>
+      <w:pPr>
+        <w:spacing w:after="60" w:before="200"/>
+        <w:jc w:val="center"/>
+      </w:pPr>
+      <w:r>
+        <w:drawing>
+          <wp:inline distT="0" distB="0" distL="0" distR="0">
+            <wp:extent cx="5905500" cy="3505200"/>
+            <wp:effectExtent t="0" r="0" b="0" l="0"/>
+            <wp:docPr id="1" name="" descr="" title=""/>
+            <wp:cNvGraphicFramePr>
+              <a:graphicFrameLocks xmlns:a="http://schemas.openxmlformats.org/drawingml/2006/main" noChangeAspect="1"/>
+            </wp:cNvGraphicFramePr>
+            <a:graphic xmlns:a="http://schemas.openxmlformats.org/drawingml/2006/main">
+              <a:graphicData uri="http://schemas.openxmlformats.org/drawingml/2006/picture">
+                <pic:pic xmlns:pic="http://schemas.openxmlformats.org/drawingml/2006/picture">
+                  <pic:nvPicPr>
+                    <pic:cNvPr id="0" name="" descr=""/>
+                    <pic:cNvPicPr>
+                      <a:picLocks noChangeAspect="1" noChangeArrowheads="1"/>
+                    </pic:cNvPicPr>
+                  </pic:nvPicPr>
+                  <pic:blipFill>
+                    <a:blip r:embed="rId14" cstate="none"/>
+                    <a:srcRect/>
+                    <a:stretch>
+                      <a:fillRect/>
+                    </a:stretch>
+                  </pic:blipFill>
+                  <pic:spPr bwMode="auto">
+                    <a:xfrm>
+                      <a:off x="0" y="0"/>
+                      <a:ext cx="5905500" cy="3505200"/>
                     </a:xfrm>
                     <a:prstGeom prst="rect">
                       <a:avLst/>
@@ -5815,6 +5951,7 @@
         <w:tc>
           <w:tcPr>
             <w:tcW w:type="dxa" w:w="2100"/>
+            <w:shd w:fill="E4F3F1" w:val="clear"/>
             <w:tcMar>
               <w:top w:type="dxa" w:w="60"/>
               <w:left w:type="dxa" w:w="100"/>
@@ -5837,6 +5974,7 @@
         <w:tc>
           <w:tcPr>
             <w:tcW w:type="dxa" w:w="4260"/>
+            <w:shd w:fill="E4F3F1" w:val="clear"/>
             <w:tcMar>
               <w:top w:type="dxa" w:w="60"/>
               <w:left w:type="dxa" w:w="100"/>
@@ -5859,6 +5997,7 @@
         <w:tc>
           <w:tcPr>
             <w:tcW w:type="dxa" w:w="3000"/>
+            <w:shd w:fill="E4F3F1" w:val="clear"/>
             <w:tcMar>
               <w:top w:type="dxa" w:w="60"/>
               <w:left w:type="dxa" w:w="100"/>
@@ -5951,6 +6090,7 @@
         <w:tc>
           <w:tcPr>
             <w:tcW w:type="dxa" w:w="2100"/>
+            <w:shd w:fill="E4F3F1" w:val="clear"/>
             <w:tcMar>
               <w:top w:type="dxa" w:w="60"/>
               <w:left w:type="dxa" w:w="100"/>
@@ -5973,6 +6113,7 @@
         <w:tc>
           <w:tcPr>
             <w:tcW w:type="dxa" w:w="4260"/>
+            <w:shd w:fill="E4F3F1" w:val="clear"/>
             <w:tcMar>
               <w:top w:type="dxa" w:w="60"/>
               <w:left w:type="dxa" w:w="100"/>
@@ -5995,6 +6136,7 @@
         <w:tc>
           <w:tcPr>
             <w:tcW w:type="dxa" w:w="3000"/>
+            <w:shd w:fill="E4F3F1" w:val="clear"/>
             <w:tcMar>
               <w:top w:type="dxa" w:w="60"/>
               <w:left w:type="dxa" w:w="100"/>
@@ -6217,6 +6359,7 @@
         <w:tc>
           <w:tcPr>
             <w:tcW w:type="dxa" w:w="3200"/>
+            <w:shd w:fill="E4F3F1" w:val="clear"/>
             <w:tcMar>
               <w:top w:type="dxa" w:w="60"/>
               <w:left w:type="dxa" w:w="100"/>
@@ -6239,6 +6382,7 @@
         <w:tc>
           <w:tcPr>
             <w:tcW w:type="dxa" w:w="6160"/>
+            <w:shd w:fill="E4F3F1" w:val="clear"/>
             <w:tcMar>
               <w:top w:type="dxa" w:w="60"/>
               <w:left w:type="dxa" w:w="100"/>
@@ -6309,6 +6453,7 @@
         <w:tc>
           <w:tcPr>
             <w:tcW w:type="dxa" w:w="3200"/>
+            <w:shd w:fill="E4F3F1" w:val="clear"/>
             <w:tcMar>
               <w:top w:type="dxa" w:w="60"/>
               <w:left w:type="dxa" w:w="100"/>
@@ -6331,6 +6476,7 @@
         <w:tc>
           <w:tcPr>
             <w:tcW w:type="dxa" w:w="6160"/>
+            <w:shd w:fill="E4F3F1" w:val="clear"/>
             <w:tcMar>
               <w:top w:type="dxa" w:w="60"/>
               <w:left w:type="dxa" w:w="100"/>
@@ -6578,6 +6724,7 @@
         <w:tc>
           <w:tcPr>
             <w:tcW w:type="dxa" w:w="2900"/>
+            <w:shd w:fill="E4F3F1" w:val="clear"/>
             <w:tcMar>
               <w:top w:type="dxa" w:w="60"/>
               <w:left w:type="dxa" w:w="100"/>
@@ -6600,6 +6747,7 @@
         <w:tc>
           <w:tcPr>
             <w:tcW w:type="dxa" w:w="1900"/>
+            <w:shd w:fill="E4F3F1" w:val="clear"/>
             <w:tcMar>
               <w:top w:type="dxa" w:w="60"/>
               <w:left w:type="dxa" w:w="100"/>
@@ -6622,6 +6770,7 @@
         <w:tc>
           <w:tcPr>
             <w:tcW w:type="dxa" w:w="4560"/>
+            <w:shd w:fill="E4F3F1" w:val="clear"/>
             <w:tcMar>
               <w:top w:type="dxa" w:w="60"/>
               <w:left w:type="dxa" w:w="100"/>
@@ -6714,6 +6863,7 @@
         <w:tc>
           <w:tcPr>
             <w:tcW w:type="dxa" w:w="2900"/>
+            <w:shd w:fill="E4F3F1" w:val="clear"/>
             <w:tcMar>
               <w:top w:type="dxa" w:w="60"/>
               <w:left w:type="dxa" w:w="100"/>
@@ -6736,6 +6886,7 @@
         <w:tc>
           <w:tcPr>
             <w:tcW w:type="dxa" w:w="1900"/>
+            <w:shd w:fill="E4F3F1" w:val="clear"/>
             <w:tcMar>
               <w:top w:type="dxa" w:w="60"/>
               <w:left w:type="dxa" w:w="100"/>
@@ -6758,6 +6909,7 @@
         <w:tc>
           <w:tcPr>
             <w:tcW w:type="dxa" w:w="4560"/>
+            <w:shd w:fill="E4F3F1" w:val="clear"/>
             <w:tcMar>
               <w:top w:type="dxa" w:w="60"/>
               <w:left w:type="dxa" w:w="100"/>

</xml_diff>

<commit_message>
Eliminate all text overlaps in the dossier infographics
Full visual audit of the six diagrams: release-path reject label moved
clear of the backstop panel and arcs, backstop body wrapped inside its
border, workflow-schematic subtitle given clearance from the first lane,
dangling trailing arrows removed from lane ends. Word document rebuilt
with the corrected figures (XSD-validated).

Co-Authored-By: Claude Fable 5 <noreply@anthropic.com>

Claude-Session: https://claude.ai/code/session_01NpGkiFWsSNcpz57BBNSGbe
</commit_message>
<xml_diff>
--- a/project-dossier/Project-Dossier-InfoSec-Assurance-Agent-Platform.docx
+++ b/project-dossier/Project-Dossier-InfoSec-Assurance-Agent-Platform.docx
@@ -3857,7 +3857,7 @@
       <w:r>
         <w:drawing>
           <wp:inline distT="0" distB="0" distL="0" distR="0">
-            <wp:extent cx="5905500" cy="4029075"/>
+            <wp:extent cx="5905500" cy="4133850"/>
             <wp:effectExtent t="0" r="0" b="0" l="0"/>
             <wp:docPr id="1" name="" descr="" title=""/>
             <wp:cNvGraphicFramePr>
@@ -3882,7 +3882,7 @@
                   <pic:spPr bwMode="auto">
                     <a:xfrm>
                       <a:off x="0" y="0"/>
-                      <a:ext cx="5905500" cy="4029075"/>
+                      <a:ext cx="5905500" cy="4133850"/>
                     </a:xfrm>
                     <a:prstGeom prst="rect">
                       <a:avLst/>

</xml_diff>

<commit_message>
Dossier v1.1: add persona coverage and advisor knowledge pack
New section 7.3 documents how the persona is implemented: the preamble on
every agent (identity, tone, English-only policy) and the knowledge
grounding of every claimed domain - six domains from the converted skills
plus the five-file advisor knowledge pack (ISO 27005, NIST CSF 2.0, CIS
v8.1, GDPR Art. 28/SCCs, management-frameworks compendium) - with a
domain-to-source table. Advisor component row updated to the 55-source
combined store; document control, cover version and appendix references
updated (PERSONA-COVERAGE.md, advisor-knowledge/). XSD-validated.

Co-Authored-By: Claude Fable 5 <noreply@anthropic.com>

Claude-Session: https://claude.ai/code/session_01NpGkiFWsSNcpz57BBNSGbe
</commit_message>
<xml_diff>
--- a/project-dossier/Project-Dossier-InfoSec-Assurance-Agent-Platform.docx
+++ b/project-dossier/Project-Dossier-InfoSec-Assurance-Agent-Platform.docx
@@ -77,7 +77,7 @@
           <w:sz w:val="20"/>
           <w:szCs w:val="20"/>
         </w:rPr>
-        <w:t xml:space="preserve">Version 1.0  ·  11 September 2026  ·  Classification: Internal</w:t>
+        <w:t xml:space="preserve">Version 1.1  ·  11 September 2026  ·  Classification: Internal</w:t>
       </w:r>
     </w:p>
     <w:p>
@@ -252,7 +252,7 @@
                 <w:sz w:val="19"/>
                 <w:szCs w:val="19"/>
               </w:rPr>
-              <w:t xml:space="preserve">1.0 — Draft for review</w:t>
+              <w:t xml:space="preserve">1.1 — Draft for review</w:t>
             </w:r>
           </w:p>
         </w:tc>
@@ -486,7 +486,7 @@
                 <w:sz w:val="19"/>
                 <w:szCs w:val="19"/>
               </w:rPr>
-              <w:t xml:space="preserve">convertion/README.md · ARCHITECTURE.md · MAPPING.md · governance/HUMAN_APPROVAL.md</w:t>
+              <w:t xml:space="preserve">convertion/README.md · ARCHITECTURE.md · MAPPING.md · governance/HUMAN_APPROVAL.md · governance/PERSONA-COVERAGE.md</w:t>
             </w:r>
           </w:p>
         </w:tc>
@@ -3199,7 +3199,7 @@
                 <w:sz w:val="19"/>
                 <w:szCs w:val="19"/>
               </w:rPr>
-              <w:t xml:space="preserve">Reasoning generalist across all persona domains; combined knowledge base (50 de-duplicated source documents) + durable team memory + web search; cites sources</w:t>
+              <w:t xml:space="preserve">Reasoning generalist across all persona domains; combined knowledge base (55 sources: every skill's knowledge + the advisor knowledge pack) + durable team memory + web search; cites sources</w:t>
             </w:r>
           </w:p>
         </w:tc>
@@ -3706,6 +3706,427 @@
                 <w:szCs w:val="19"/>
               </w:rPr>
               <w:t xml:space="preserve">This document, its infographics, and their generator</w:t>
+            </w:r>
+          </w:p>
+        </w:tc>
+      </w:tr>
+    </w:tbl>
+    <w:p>
+      <w:pPr>
+        <w:spacing w:after="200"/>
+      </w:pPr>
+    </w:p>
+    <w:p>
+      <w:pPr>
+        <w:pStyle w:val="Heading2"/>
+        <w:spacing w:after="120" w:before="260"/>
+      </w:pPr>
+      <w:r>
+        <w:t xml:space="preserve">7.3 Persona coverage and the advisor knowledge pack</w:t>
+      </w:r>
+    </w:p>
+    <w:p>
+      <w:pPr>
+        <w:spacing w:after="140"/>
+        <w:jc w:val="both"/>
+      </w:pPr>
+      <w:r>
+        <w:t xml:space="preserve">The team persona (Principal Security Assurance Consultant &amp; TPRM Lead - professional, precise, evidence-led, English-only) is prepended to every agent's instructions, so identity, tone and language policy are uniform across the platform. Beyond the statement itself, every knowledge domain the persona claims is grounded in the combined vector store, so the advisor retrieves and cites sources rather than answering from model memory alone. Six domains arrive with the converted skills; the remaining four, plus the management-framework expertise, are grounded by a dedicated advisor knowledge pack (agents/advisor-knowledge/, ~860 lines across five authored references, each carrying a provenance header distinguishing it from exported claude.ai content). The full traceability matrix, with verification commands, is governance/PERSONA-COVERAGE.md.</w:t>
+      </w:r>
+    </w:p>
+    <w:tbl>
+      <w:tblPr>
+        <w:tblW w:type="dxa" w:w="9360"/>
+        <w:tblBorders>
+          <w:top w:val="single" w:color="auto" w:sz="4"/>
+          <w:left w:val="single" w:color="auto" w:sz="4"/>
+          <w:bottom w:val="single" w:color="auto" w:sz="4"/>
+          <w:right w:val="single" w:color="auto" w:sz="4"/>
+          <w:insideH w:val="single" w:color="auto" w:sz="4"/>
+          <w:insideV w:val="single" w:color="auto" w:sz="4"/>
+        </w:tblBorders>
+      </w:tblPr>
+      <w:tblGrid>
+        <w:gridCol w:w="3600"/>
+        <w:gridCol w:w="5760"/>
+      </w:tblGrid>
+      <w:tr>
+        <w:trPr>
+          <w:tblHeader/>
+        </w:trPr>
+        <w:tc>
+          <w:tcPr>
+            <w:tcW w:type="dxa" w:w="3600"/>
+            <w:shd w:fill="008D7F" w:val="clear"/>
+            <w:tcMar>
+              <w:top w:type="dxa" w:w="60"/>
+              <w:left w:type="dxa" w:w="100"/>
+              <w:bottom w:type="dxa" w:w="60"/>
+              <w:right w:type="dxa" w:w="100"/>
+            </w:tcMar>
+          </w:tcPr>
+          <w:p>
+            <w:r>
+              <w:rPr>
+                <w:b/>
+                <w:bCs/>
+                <w:color w:val="FFFFFF"/>
+                <w:sz w:val="19"/>
+                <w:szCs w:val="19"/>
+              </w:rPr>
+              <w:t xml:space="preserve">Persona domain</w:t>
+            </w:r>
+          </w:p>
+        </w:tc>
+        <w:tc>
+          <w:tcPr>
+            <w:tcW w:type="dxa" w:w="5760"/>
+            <w:shd w:fill="008D7F" w:val="clear"/>
+            <w:tcMar>
+              <w:top w:type="dxa" w:w="60"/>
+              <w:left w:type="dxa" w:w="100"/>
+              <w:bottom w:type="dxa" w:w="60"/>
+              <w:right w:type="dxa" w:w="100"/>
+            </w:tcMar>
+          </w:tcPr>
+          <w:p>
+            <w:r>
+              <w:rPr>
+                <w:b/>
+                <w:bCs/>
+                <w:color w:val="FFFFFF"/>
+                <w:sz w:val="19"/>
+                <w:szCs w:val="19"/>
+              </w:rPr>
+              <w:t xml:space="preserve">Knowledge grounding in the combined store</w:t>
+            </w:r>
+          </w:p>
+        </w:tc>
+      </w:tr>
+      <w:tr>
+        <w:tc>
+          <w:tcPr>
+            <w:tcW w:type="dxa" w:w="3600"/>
+            <w:tcMar>
+              <w:top w:type="dxa" w:w="60"/>
+              <w:left w:type="dxa" w:w="100"/>
+              <w:bottom w:type="dxa" w:w="60"/>
+              <w:right w:type="dxa" w:w="100"/>
+            </w:tcMar>
+          </w:tcPr>
+          <w:p>
+            <w:r>
+              <w:rPr>
+                <w:b w:val="false"/>
+                <w:bCs w:val="false"/>
+                <w:sz w:val="19"/>
+                <w:szCs w:val="19"/>
+              </w:rPr>
+              <w:t xml:space="preserve">ISO/IEC 27001:2022 / 27002:2022</w:t>
+            </w:r>
+          </w:p>
+        </w:tc>
+        <w:tc>
+          <w:tcPr>
+            <w:tcW w:type="dxa" w:w="5760"/>
+            <w:tcMar>
+              <w:top w:type="dxa" w:w="60"/>
+              <w:left w:type="dxa" w:w="100"/>
+              <w:bottom w:type="dxa" w:w="60"/>
+              <w:right w:type="dxa" w:w="100"/>
+            </w:tcMar>
+          </w:tcPr>
+          <w:p>
+            <w:r>
+              <w:rPr>
+                <w:b w:val="false"/>
+                <w:bCs w:val="false"/>
+                <w:sz w:val="19"/>
+                <w:szCs w:val="19"/>
+              </w:rPr>
+              <w:t xml:space="preserve">Converted iso27001 skill: Annex A 2022 (93 controls), Annex A 2013, 2013→2022 transition mapping</w:t>
+            </w:r>
+          </w:p>
+        </w:tc>
+      </w:tr>
+      <w:tr>
+        <w:tc>
+          <w:tcPr>
+            <w:tcW w:type="dxa" w:w="3600"/>
+            <w:shd w:fill="E4F3F1" w:val="clear"/>
+            <w:tcMar>
+              <w:top w:type="dxa" w:w="60"/>
+              <w:left w:type="dxa" w:w="100"/>
+              <w:bottom w:type="dxa" w:w="60"/>
+              <w:right w:type="dxa" w:w="100"/>
+            </w:tcMar>
+          </w:tcPr>
+          <w:p>
+            <w:r>
+              <w:rPr>
+                <w:b w:val="false"/>
+                <w:bCs w:val="false"/>
+                <w:sz w:val="19"/>
+                <w:szCs w:val="19"/>
+              </w:rPr>
+              <w:t xml:space="preserve">DORA · NIS2 · EU AI Act · ISO/IEC 42001</w:t>
+            </w:r>
+          </w:p>
+        </w:tc>
+        <w:tc>
+          <w:tcPr>
+            <w:tcW w:type="dxa" w:w="5760"/>
+            <w:shd w:fill="E4F3F1" w:val="clear"/>
+            <w:tcMar>
+              <w:top w:type="dxa" w:w="60"/>
+              <w:left w:type="dxa" w:w="100"/>
+              <w:bottom w:type="dxa" w:w="60"/>
+              <w:right w:type="dxa" w:w="100"/>
+            </w:tcMar>
+          </w:tcPr>
+          <w:p>
+            <w:r>
+              <w:rPr>
+                <w:b w:val="false"/>
+                <w:bCs w:val="false"/>
+                <w:sz w:val="19"/>
+                <w:szCs w:val="19"/>
+              </w:rPr>
+              <w:t xml:space="preserve">Converted regulatory skills: article references, RTS/ITS guide, Art. 21 measures, risk-tier classification, AIMS clauses and controls</w:t>
+            </w:r>
+          </w:p>
+        </w:tc>
+      </w:tr>
+      <w:tr>
+        <w:tc>
+          <w:tcPr>
+            <w:tcW w:type="dxa" w:w="3600"/>
+            <w:tcMar>
+              <w:top w:type="dxa" w:w="60"/>
+              <w:left w:type="dxa" w:w="100"/>
+              <w:bottom w:type="dxa" w:w="60"/>
+              <w:right w:type="dxa" w:w="100"/>
+            </w:tcMar>
+          </w:tcPr>
+          <w:p>
+            <w:r>
+              <w:rPr>
+                <w:b w:val="false"/>
+                <w:bCs w:val="false"/>
+                <w:sz w:val="19"/>
+                <w:szCs w:val="19"/>
+              </w:rPr>
+              <w:t xml:space="preserve">ISO/IEC 27005:2022</w:t>
+            </w:r>
+          </w:p>
+        </w:tc>
+        <w:tc>
+          <w:tcPr>
+            <w:tcW w:type="dxa" w:w="5760"/>
+            <w:tcMar>
+              <w:top w:type="dxa" w:w="60"/>
+              <w:left w:type="dxa" w:w="100"/>
+              <w:bottom w:type="dxa" w:w="60"/>
+              <w:right w:type="dxa" w:w="100"/>
+            </w:tcMar>
+          </w:tcPr>
+          <w:p>
+            <w:r>
+              <w:rPr>
+                <w:b w:val="false"/>
+                <w:bCs w:val="false"/>
+                <w:sz w:val="19"/>
+                <w:szCs w:val="19"/>
+              </w:rPr>
+              <w:t xml:space="preserve">Pack: risk-management process, criteria design, worked TPRM supplier scenario, process-step → ISMS artefact map</w:t>
+            </w:r>
+          </w:p>
+        </w:tc>
+      </w:tr>
+      <w:tr>
+        <w:tc>
+          <w:tcPr>
+            <w:tcW w:type="dxa" w:w="3600"/>
+            <w:shd w:fill="E4F3F1" w:val="clear"/>
+            <w:tcMar>
+              <w:top w:type="dxa" w:w="60"/>
+              <w:left w:type="dxa" w:w="100"/>
+              <w:bottom w:type="dxa" w:w="60"/>
+              <w:right w:type="dxa" w:w="100"/>
+            </w:tcMar>
+          </w:tcPr>
+          <w:p>
+            <w:r>
+              <w:rPr>
+                <w:b w:val="false"/>
+                <w:bCs w:val="false"/>
+                <w:sz w:val="19"/>
+                <w:szCs w:val="19"/>
+              </w:rPr>
+              <w:t xml:space="preserve">NIST CSF 2.0</w:t>
+            </w:r>
+          </w:p>
+        </w:tc>
+        <w:tc>
+          <w:tcPr>
+            <w:tcW w:type="dxa" w:w="5760"/>
+            <w:shd w:fill="E4F3F1" w:val="clear"/>
+            <w:tcMar>
+              <w:top w:type="dxa" w:w="60"/>
+              <w:left w:type="dxa" w:w="100"/>
+              <w:bottom w:type="dxa" w:w="60"/>
+              <w:right w:type="dxa" w:w="100"/>
+            </w:tcMar>
+          </w:tcPr>
+          <w:p>
+            <w:r>
+              <w:rPr>
+                <w:b w:val="false"/>
+                <w:bCs w:val="false"/>
+                <w:sz w:val="19"/>
+                <w:szCs w:val="19"/>
+              </w:rPr>
+              <w:t xml:space="preserve">Pack: six Functions with exact category identifiers, GV.SC mapped to the TPRM lifecycle, ISO 27001 crosswalk</w:t>
+            </w:r>
+          </w:p>
+        </w:tc>
+      </w:tr>
+      <w:tr>
+        <w:tc>
+          <w:tcPr>
+            <w:tcW w:type="dxa" w:w="3600"/>
+            <w:tcMar>
+              <w:top w:type="dxa" w:w="60"/>
+              <w:left w:type="dxa" w:w="100"/>
+              <w:bottom w:type="dxa" w:w="60"/>
+              <w:right w:type="dxa" w:w="100"/>
+            </w:tcMar>
+          </w:tcPr>
+          <w:p>
+            <w:r>
+              <w:rPr>
+                <w:b w:val="false"/>
+                <w:bCs w:val="false"/>
+                <w:sz w:val="19"/>
+                <w:szCs w:val="19"/>
+              </w:rPr>
+              <w:t xml:space="preserve">CIS Controls v8.1</w:t>
+            </w:r>
+          </w:p>
+        </w:tc>
+        <w:tc>
+          <w:tcPr>
+            <w:tcW w:type="dxa" w:w="5760"/>
+            <w:tcMar>
+              <w:top w:type="dxa" w:w="60"/>
+              <w:left w:type="dxa" w:w="100"/>
+              <w:bottom w:type="dxa" w:w="60"/>
+              <w:right w:type="dxa" w:w="100"/>
+            </w:tcMar>
+          </w:tcPr>
+          <w:p>
+            <w:r>
+              <w:rPr>
+                <w:b w:val="false"/>
+                <w:bCs w:val="false"/>
+                <w:sz w:val="19"/>
+                <w:szCs w:val="19"/>
+              </w:rPr>
+              <w:t xml:space="preserve">Pack: 18 controls, IG1–3 supplier proportionality, v8.1 governance updates, Annex A mapping</w:t>
+            </w:r>
+          </w:p>
+        </w:tc>
+      </w:tr>
+      <w:tr>
+        <w:tc>
+          <w:tcPr>
+            <w:tcW w:type="dxa" w:w="3600"/>
+            <w:shd w:fill="E4F3F1" w:val="clear"/>
+            <w:tcMar>
+              <w:top w:type="dxa" w:w="60"/>
+              <w:left w:type="dxa" w:w="100"/>
+              <w:bottom w:type="dxa" w:w="60"/>
+              <w:right w:type="dxa" w:w="100"/>
+            </w:tcMar>
+          </w:tcPr>
+          <w:p>
+            <w:r>
+              <w:rPr>
+                <w:b w:val="false"/>
+                <w:bCs w:val="false"/>
+                <w:sz w:val="19"/>
+                <w:szCs w:val="19"/>
+              </w:rPr>
+              <w:t xml:space="preserve">GDPR Art. 28 / SCCs 2021/914</w:t>
+            </w:r>
+          </w:p>
+        </w:tc>
+        <w:tc>
+          <w:tcPr>
+            <w:tcW w:type="dxa" w:w="5760"/>
+            <w:shd w:fill="E4F3F1" w:val="clear"/>
+            <w:tcMar>
+              <w:top w:type="dxa" w:w="60"/>
+              <w:left w:type="dxa" w:w="100"/>
+              <w:bottom w:type="dxa" w:w="60"/>
+              <w:right w:type="dxa" w:w="100"/>
+            </w:tcMar>
+          </w:tcPr>
+          <w:p>
+            <w:r>
+              <w:rPr>
+                <w:b w:val="false"/>
+                <w:bCs w:val="false"/>
+                <w:sz w:val="19"/>
+                <w:szCs w:val="19"/>
+              </w:rPr>
+              <w:t xml:space="preserve">Pack: Art. 28(3)(a)–(h) contract clauses, four SCC modules, Schrems II TIA, processor-agreement checklist</w:t>
+            </w:r>
+          </w:p>
+        </w:tc>
+      </w:tr>
+      <w:tr>
+        <w:tc>
+          <w:tcPr>
+            <w:tcW w:type="dxa" w:w="3600"/>
+            <w:tcMar>
+              <w:top w:type="dxa" w:w="60"/>
+              <w:left w:type="dxa" w:w="100"/>
+              <w:bottom w:type="dxa" w:w="60"/>
+              <w:right w:type="dxa" w:w="100"/>
+            </w:tcMar>
+          </w:tcPr>
+          <w:p>
+            <w:r>
+              <w:rPr>
+                <w:b w:val="false"/>
+                <w:bCs w:val="false"/>
+                <w:sz w:val="19"/>
+                <w:szCs w:val="19"/>
+              </w:rPr>
+              <w:t xml:space="preserve">PMBOK 7 · ITIL 4 · COBIT 2019 · COSO · TOGAF 10 · agile/Lean IT · ISO 20000-1 · cloud/ICT assurance</w:t>
+            </w:r>
+          </w:p>
+        </w:tc>
+        <w:tc>
+          <w:tcPr>
+            <w:tcW w:type="dxa" w:w="5760"/>
+            <w:tcMar>
+              <w:top w:type="dxa" w:w="60"/>
+              <w:left w:type="dxa" w:w="100"/>
+              <w:bottom w:type="dxa" w:w="60"/>
+              <w:right w:type="dxa" w:w="100"/>
+            </w:tcMar>
+          </w:tcPr>
+          <w:p>
+            <w:r>
+              <w:rPr>
+                <w:b w:val="false"/>
+                <w:bCs w:val="false"/>
+                <w:sz w:val="19"/>
+                <w:szCs w:val="19"/>
+              </w:rPr>
+              <w:t xml:space="preserve">Pack: management-frameworks compendium with a framework → assurance-use cross-walk</w:t>
             </w:r>
           </w:p>
         </w:tc>
@@ -7132,6 +7553,32 @@
       </w:pPr>
       <w:r>
         <w:t xml:space="preserve">convertion/governance/HUMAN_APPROVAL.md — the approval policy and compliance mapping</w:t>
+      </w:r>
+    </w:p>
+    <w:p>
+      <w:pPr>
+        <w:pStyle w:val="ListParagraph"/>
+        <w:numPr>
+          <w:ilvl w:val="0"/>
+          <w:numId w:val="2"/>
+        </w:numPr>
+        <w:spacing w:after="80"/>
+      </w:pPr>
+      <w:r>
+        <w:t xml:space="preserve">convertion/governance/PERSONA-COVERAGE.md — persona-to-implementation traceability matrix</w:t>
+      </w:r>
+    </w:p>
+    <w:p>
+      <w:pPr>
+        <w:pStyle w:val="ListParagraph"/>
+        <w:numPr>
+          <w:ilvl w:val="0"/>
+          <w:numId w:val="2"/>
+        </w:numPr>
+        <w:spacing w:after="80"/>
+      </w:pPr>
+      <w:r>
+        <w:t xml:space="preserve">convertion/agents/advisor-knowledge/ — the five authored references grounding the remaining persona domains</w:t>
       </w:r>
     </w:p>
     <w:p>

</xml_diff>